<commit_message>
atlh, srvi, transfer deed signature verification
</commit_message>
<xml_diff>
--- a/atrl-1110140-MAK/ATRL-2602-FL.docx
+++ b/atrl-1110140-MAK/ATRL-2602-FL.docx
@@ -154,25 +154,43 @@
           <w:szCs w:val="20"/>
           <w:u w:val="none"/>
         </w:rPr>
-        <w:t xml:space="preserve">April </w:t>
-      </w:r>
-      <w:r>
-        <w:rPr>
-          <w:color w:val="auto"/>
-          <w:sz w:val="20"/>
-          <w:szCs w:val="20"/>
-          <w:u w:val="none"/>
-        </w:rPr>
-        <w:t>25</w:t>
-      </w:r>
-      <w:r>
-        <w:rPr>
-          <w:color w:val="auto"/>
-          <w:sz w:val="20"/>
-          <w:szCs w:val="20"/>
-          <w:u w:val="none"/>
-        </w:rPr>
-        <w:t>, 2025</w:t>
+        <w:fldChar w:fldCharType="begin"/>
+      </w:r>
+      <w:r>
+        <w:rPr>
+          <w:color w:val="auto"/>
+          <w:sz w:val="20"/>
+          <w:szCs w:val="20"/>
+          <w:u w:val="none"/>
+        </w:rPr>
+        <w:instrText xml:space="preserve"> DOCPROPERTY "DateDispatched"</w:instrText>
+      </w:r>
+      <w:r>
+        <w:rPr>
+          <w:color w:val="auto"/>
+          <w:sz w:val="20"/>
+          <w:szCs w:val="20"/>
+          <w:u w:val="none"/>
+        </w:rPr>
+        <w:fldChar w:fldCharType="separate"/>
+      </w:r>
+      <w:r>
+        <w:rPr>
+          <w:color w:val="auto"/>
+          <w:sz w:val="20"/>
+          <w:szCs w:val="20"/>
+          <w:u w:val="none"/>
+        </w:rPr>
+        <w:t>May 4, 2026</w:t>
+      </w:r>
+      <w:r>
+        <w:rPr>
+          <w:color w:val="auto"/>
+          <w:sz w:val="20"/>
+          <w:szCs w:val="20"/>
+          <w:u w:val="none"/>
+        </w:rPr>
+        <w:fldChar w:fldCharType="end"/>
       </w:r>
     </w:p>
     <w:p>
@@ -277,33 +295,238 @@
           <w:szCs w:val="20"/>
           <w:u w:val="none"/>
         </w:rPr>
-        <w:t xml:space="preserve">Transmission </w:t>
-      </w:r>
+        <w:t>Transmission of Shares and Dividends – Late Mohammad Ayub Khan</w:t>
+      </w:r>
+    </w:p>
+    <w:p>
+      <w:pPr>
+        <w:pStyle w:val="Default"/>
+        <w:numPr>
+          <w:ilvl w:val="0"/>
+          <w:numId w:val="2"/>
+        </w:numPr>
+        <w:tabs>
+          <w:tab w:val="clear" w:pos="720"/>
+          <w:tab w:val="left" w:pos="400" w:leader="none"/>
+        </w:tabs>
+        <w:bidi w:val="0"/>
+        <w:jc w:val="start"/>
+        <w:rPr>
+          <w:rFonts w:ascii="Calibri" w:hAnsi="Calibri"/>
+          <w:sz w:val="20"/>
+          <w:szCs w:val="20"/>
+        </w:rPr>
+      </w:pPr>
       <w:r>
         <w:rPr>
           <w:b/>
           <w:bCs/>
-          <w:strike w:val="false"/>
-          <w:dstrike w:val="false"/>
-          <w:color w:val="auto"/>
-          <w:sz w:val="20"/>
-          <w:szCs w:val="20"/>
-          <w:u w:val="none"/>
-        </w:rPr>
-        <w:t>of Shares and Dividends</w:t>
+          <w:sz w:val="20"/>
+          <w:szCs w:val="20"/>
+        </w:rPr>
+        <w:fldChar w:fldCharType="begin"/>
       </w:r>
       <w:r>
         <w:rPr>
           <w:b/>
           <w:bCs/>
-          <w:strike w:val="false"/>
-          <w:dstrike w:val="false"/>
-          <w:color w:val="auto"/>
-          <w:sz w:val="20"/>
-          <w:szCs w:val="20"/>
-          <w:u w:val="none"/>
-        </w:rPr>
-        <w:t xml:space="preserve"> – Late Mohammad Ayub Khan</w:t>
+          <w:sz w:val="20"/>
+          <w:szCs w:val="20"/>
+        </w:rPr>
+        <w:instrText xml:space="preserve"> DOCPROPERTY "Company"</w:instrText>
+      </w:r>
+      <w:r>
+        <w:rPr>
+          <w:b/>
+          <w:bCs/>
+          <w:sz w:val="20"/>
+          <w:szCs w:val="20"/>
+        </w:rPr>
+        <w:fldChar w:fldCharType="separate"/>
+      </w:r>
+      <w:r>
+        <w:rPr>
+          <w:b/>
+          <w:bCs/>
+          <w:sz w:val="20"/>
+          <w:szCs w:val="20"/>
+        </w:rPr>
+        <w:t>Attock Refinery Limited</w:t>
+      </w:r>
+      <w:r>
+        <w:rPr>
+          <w:b/>
+          <w:bCs/>
+          <w:sz w:val="20"/>
+          <w:szCs w:val="20"/>
+        </w:rPr>
+        <w:fldChar w:fldCharType="end"/>
+      </w:r>
+      <w:r>
+        <w:rPr>
+          <w:b/>
+          <w:bCs/>
+          <w:sz w:val="20"/>
+          <w:szCs w:val="20"/>
+        </w:rPr>
+        <w:t xml:space="preserve">- Folio # </w:t>
+      </w:r>
+      <w:r>
+        <w:rPr>
+          <w:b/>
+          <w:bCs/>
+          <w:sz w:val="20"/>
+          <w:szCs w:val="20"/>
+        </w:rPr>
+        <w:fldChar w:fldCharType="begin"/>
+      </w:r>
+      <w:r>
+        <w:rPr>
+          <w:b/>
+          <w:bCs/>
+          <w:sz w:val="20"/>
+          <w:szCs w:val="20"/>
+        </w:rPr>
+        <w:instrText xml:space="preserve"> DOCPROPERTY "Folio1"</w:instrText>
+      </w:r>
+      <w:r>
+        <w:rPr>
+          <w:b/>
+          <w:bCs/>
+          <w:sz w:val="20"/>
+          <w:szCs w:val="20"/>
+        </w:rPr>
+        <w:fldChar w:fldCharType="separate"/>
+      </w:r>
+      <w:r>
+        <w:rPr>
+          <w:b/>
+          <w:bCs/>
+          <w:sz w:val="20"/>
+          <w:szCs w:val="20"/>
+        </w:rPr>
+        <w:t>1110140</w:t>
+      </w:r>
+      <w:r>
+        <w:rPr>
+          <w:b/>
+          <w:bCs/>
+          <w:sz w:val="20"/>
+          <w:szCs w:val="20"/>
+        </w:rPr>
+        <w:fldChar w:fldCharType="end"/>
+      </w:r>
+    </w:p>
+    <w:p>
+      <w:pPr>
+        <w:pStyle w:val="Default"/>
+        <w:tabs>
+          <w:tab w:val="clear" w:pos="720"/>
+          <w:tab w:val="left" w:pos="400" w:leader="none"/>
+        </w:tabs>
+        <w:bidi w:val="0"/>
+        <w:jc w:val="start"/>
+        <w:rPr>
+          <w:rFonts w:ascii="Calibri" w:hAnsi="Calibri"/>
+          <w:color w:val="auto"/>
+          <w:sz w:val="20"/>
+          <w:szCs w:val="20"/>
+        </w:rPr>
+      </w:pPr>
+      <w:r>
+        <w:rPr>
+          <w:color w:val="auto"/>
+          <w:sz w:val="20"/>
+          <w:szCs w:val="20"/>
+        </w:rPr>
+      </w:r>
+    </w:p>
+    <w:p>
+      <w:pPr>
+        <w:pStyle w:val="Default"/>
+        <w:tabs>
+          <w:tab w:val="clear" w:pos="720"/>
+          <w:tab w:val="left" w:pos="400" w:leader="none"/>
+        </w:tabs>
+        <w:bidi w:val="0"/>
+        <w:jc w:val="start"/>
+        <w:rPr>
+          <w:rFonts w:ascii="Calibri" w:hAnsi="Calibri"/>
+          <w:sz w:val="20"/>
+          <w:szCs w:val="20"/>
+        </w:rPr>
+      </w:pPr>
+      <w:r>
+        <w:rPr>
+          <w:b w:val="false"/>
+          <w:strike w:val="false"/>
+          <w:dstrike w:val="false"/>
+          <w:color w:val="auto"/>
+          <w:sz w:val="20"/>
+          <w:szCs w:val="20"/>
+          <w:u w:val="none"/>
+        </w:rPr>
+        <w:t xml:space="preserve">Dear Sirs, </w:t>
+      </w:r>
+    </w:p>
+    <w:p>
+      <w:pPr>
+        <w:pStyle w:val="Default"/>
+        <w:tabs>
+          <w:tab w:val="clear" w:pos="720"/>
+          <w:tab w:val="left" w:pos="400" w:leader="none"/>
+        </w:tabs>
+        <w:bidi w:val="0"/>
+        <w:jc w:val="start"/>
+        <w:rPr>
+          <w:rFonts w:ascii="Calibri" w:hAnsi="Calibri"/>
+          <w:b w:val="false"/>
+          <w:strike w:val="false"/>
+          <w:dstrike w:val="false"/>
+          <w:color w:val="auto"/>
+          <w:sz w:val="20"/>
+          <w:szCs w:val="20"/>
+          <w:u w:val="none"/>
+        </w:rPr>
+      </w:pPr>
+      <w:r>
+        <w:rPr>
+          <w:b w:val="false"/>
+          <w:strike w:val="false"/>
+          <w:dstrike w:val="false"/>
+          <w:color w:val="auto"/>
+          <w:sz w:val="20"/>
+          <w:szCs w:val="20"/>
+          <w:u w:val="none"/>
+        </w:rPr>
+      </w:r>
+    </w:p>
+    <w:p>
+      <w:pPr>
+        <w:pStyle w:val="Default"/>
+        <w:tabs>
+          <w:tab w:val="clear" w:pos="720"/>
+          <w:tab w:val="left" w:pos="400" w:leader="none"/>
+        </w:tabs>
+        <w:bidi w:val="0"/>
+        <w:jc w:val="both"/>
+        <w:rPr>
+          <w:rFonts w:ascii="Calibri" w:hAnsi="Calibri"/>
+          <w:sz w:val="20"/>
+          <w:szCs w:val="20"/>
+        </w:rPr>
+      </w:pPr>
+      <w:r>
+        <w:rPr>
+          <w:b w:val="false"/>
+          <w:strike w:val="false"/>
+          <w:dstrike w:val="false"/>
+          <w:color w:val="auto"/>
+          <w:sz w:val="20"/>
+          <w:szCs w:val="20"/>
+          <w:u w:val="none"/>
+        </w:rPr>
+        <w:t>I refer to your letter:</w:t>
       </w:r>
     </w:p>
     <w:p>
@@ -318,111 +541,89 @@
           <w:tab w:val="left" w:pos="400" w:leader="none"/>
         </w:tabs>
         <w:bidi w:val="0"/>
-        <w:jc w:val="start"/>
+        <w:jc w:val="both"/>
         <w:rPr>
           <w:rFonts w:ascii="Calibri" w:hAnsi="Calibri"/>
-          <w:sz w:val="20"/>
-          <w:szCs w:val="20"/>
-        </w:rPr>
-      </w:pPr>
-      <w:r>
-        <w:rPr>
-          <w:b/>
-          <w:bCs/>
-          <w:sz w:val="20"/>
-          <w:szCs w:val="20"/>
+          <w:b w:val="false"/>
+          <w:strike w:val="false"/>
+          <w:dstrike w:val="false"/>
+          <w:color w:val="auto"/>
+          <w:sz w:val="20"/>
+          <w:szCs w:val="20"/>
+          <w:u w:val="none"/>
+        </w:rPr>
+      </w:pPr>
+      <w:r>
+        <w:rPr>
+          <w:b w:val="false"/>
+          <w:strike w:val="false"/>
+          <w:dstrike w:val="false"/>
+          <w:color w:val="auto"/>
+          <w:sz w:val="20"/>
+          <w:szCs w:val="20"/>
+          <w:u w:val="none"/>
         </w:rPr>
         <w:fldChar w:fldCharType="begin"/>
       </w:r>
       <w:r>
         <w:rPr>
-          <w:b/>
-          <w:bCs/>
-          <w:sz w:val="20"/>
-          <w:szCs w:val="20"/>
-        </w:rPr>
-        <w:instrText xml:space="preserve"> DOCPROPERTY "Company"</w:instrText>
-      </w:r>
-      <w:r>
-        <w:rPr>
-          <w:b/>
-          <w:bCs/>
-          <w:sz w:val="20"/>
-          <w:szCs w:val="20"/>
+          <w:b w:val="false"/>
+          <w:strike w:val="false"/>
+          <w:dstrike w:val="false"/>
+          <w:color w:val="auto"/>
+          <w:sz w:val="20"/>
+          <w:szCs w:val="20"/>
+          <w:u w:val="none"/>
+        </w:rPr>
+        <w:instrText xml:space="preserve"> DOCPROPERTY "ReferenceSender"</w:instrText>
+      </w:r>
+      <w:r>
+        <w:rPr>
+          <w:b w:val="false"/>
+          <w:strike w:val="false"/>
+          <w:dstrike w:val="false"/>
+          <w:color w:val="auto"/>
+          <w:sz w:val="20"/>
+          <w:szCs w:val="20"/>
+          <w:u w:val="none"/>
         </w:rPr>
         <w:fldChar w:fldCharType="separate"/>
       </w:r>
       <w:r>
         <w:rPr>
-          <w:b/>
-          <w:bCs/>
-          <w:sz w:val="20"/>
-          <w:szCs w:val="20"/>
-        </w:rPr>
-        <w:t>Attock Refinery Limited</w:t>
-      </w:r>
-      <w:r>
-        <w:rPr>
-          <w:b/>
-          <w:bCs/>
-          <w:sz w:val="20"/>
-          <w:szCs w:val="20"/>
+          <w:b w:val="false"/>
+          <w:strike w:val="false"/>
+          <w:dstrike w:val="false"/>
+          <w:color w:val="auto"/>
+          <w:sz w:val="20"/>
+          <w:szCs w:val="20"/>
+          <w:u w:val="none"/>
+        </w:rPr>
+        <w:t>CDCSR/LTC/ATRL/1005/26</w:t>
+      </w:r>
+      <w:r>
+        <w:rPr>
+          <w:b w:val="false"/>
+          <w:strike w:val="false"/>
+          <w:dstrike w:val="false"/>
+          <w:color w:val="auto"/>
+          <w:sz w:val="20"/>
+          <w:szCs w:val="20"/>
+          <w:u w:val="none"/>
         </w:rPr>
         <w:fldChar w:fldCharType="end"/>
       </w:r>
       <w:r>
         <w:rPr>
-          <w:b/>
-          <w:bCs/>
-          <w:sz w:val="20"/>
-          <w:szCs w:val="20"/>
-        </w:rPr>
-        <w:t xml:space="preserve">- Folio # </w:t>
-      </w:r>
-      <w:r>
-        <w:rPr>
-          <w:b/>
-          <w:bCs/>
-          <w:sz w:val="20"/>
-          <w:szCs w:val="20"/>
-        </w:rPr>
-        <w:fldChar w:fldCharType="begin"/>
-      </w:r>
-      <w:r>
-        <w:rPr>
-          <w:b/>
-          <w:bCs/>
-          <w:sz w:val="20"/>
-          <w:szCs w:val="20"/>
-        </w:rPr>
-        <w:instrText xml:space="preserve"> DOCPROPERTY "Folio1"</w:instrText>
-      </w:r>
-      <w:r>
-        <w:rPr>
-          <w:b/>
-          <w:bCs/>
-          <w:sz w:val="20"/>
-          <w:szCs w:val="20"/>
-        </w:rPr>
-        <w:fldChar w:fldCharType="separate"/>
-      </w:r>
-      <w:r>
-        <w:rPr>
-          <w:b/>
-          <w:bCs/>
-          <w:sz w:val="20"/>
-          <w:szCs w:val="20"/>
-        </w:rPr>
-        <w:t>1110140</w:t>
-      </w:r>
-      <w:r>
-        <w:rPr>
-          <w:b/>
-          <w:bCs/>
-          <w:sz w:val="20"/>
-          <w:szCs w:val="20"/>
-        </w:rPr>
-        <w:fldChar w:fldCharType="end"/>
+          <w:b w:val="false"/>
+          <w:strike w:val="false"/>
+          <w:dstrike w:val="false"/>
+          <w:color w:val="auto"/>
+          <w:sz w:val="20"/>
+          <w:szCs w:val="20"/>
+          <w:u w:val="none"/>
+        </w:rPr>
+        <w:t>.</w:t>
       </w:r>
     </w:p>
     <w:p>
@@ -433,19 +634,29 @@
           <w:tab w:val="left" w:pos="400" w:leader="none"/>
         </w:tabs>
         <w:bidi w:val="0"/>
-        <w:jc w:val="start"/>
+        <w:jc w:val="both"/>
         <w:rPr>
           <w:rFonts w:ascii="Calibri" w:hAnsi="Calibri"/>
-          <w:color w:val="auto"/>
-          <w:sz w:val="20"/>
-          <w:szCs w:val="20"/>
-        </w:rPr>
-      </w:pPr>
-      <w:r>
-        <w:rPr>
-          <w:color w:val="auto"/>
-          <w:sz w:val="20"/>
-          <w:szCs w:val="20"/>
+          <w:b w:val="false"/>
+          <w:bCs w:val="false"/>
+          <w:strike w:val="false"/>
+          <w:dstrike w:val="false"/>
+          <w:color w:val="auto"/>
+          <w:sz w:val="20"/>
+          <w:szCs w:val="20"/>
+          <w:u w:val="none"/>
+        </w:rPr>
+      </w:pPr>
+      <w:r>
+        <w:rPr>
+          <w:b w:val="false"/>
+          <w:bCs w:val="false"/>
+          <w:strike w:val="false"/>
+          <w:dstrike w:val="false"/>
+          <w:color w:val="auto"/>
+          <w:sz w:val="20"/>
+          <w:szCs w:val="20"/>
+          <w:u w:val="none"/>
         </w:rPr>
       </w:r>
     </w:p>
@@ -457,84 +668,31 @@
           <w:tab w:val="left" w:pos="400" w:leader="none"/>
         </w:tabs>
         <w:bidi w:val="0"/>
-        <w:jc w:val="start"/>
+        <w:jc w:val="both"/>
         <w:rPr>
           <w:rFonts w:ascii="Calibri" w:hAnsi="Calibri"/>
-          <w:sz w:val="20"/>
-          <w:szCs w:val="20"/>
-        </w:rPr>
-      </w:pPr>
-      <w:r>
-        <w:rPr>
-          <w:b w:val="false"/>
-          <w:strike w:val="false"/>
-          <w:dstrike w:val="false"/>
-          <w:color w:val="auto"/>
-          <w:sz w:val="20"/>
-          <w:szCs w:val="20"/>
-          <w:u w:val="none"/>
-        </w:rPr>
-        <w:t xml:space="preserve">Dear Sirs, </w:t>
-      </w:r>
-    </w:p>
-    <w:p>
-      <w:pPr>
-        <w:pStyle w:val="Default"/>
-        <w:tabs>
-          <w:tab w:val="clear" w:pos="720"/>
-          <w:tab w:val="left" w:pos="400" w:leader="none"/>
-        </w:tabs>
-        <w:bidi w:val="0"/>
-        <w:jc w:val="start"/>
-        <w:rPr>
-          <w:rFonts w:ascii="Calibri" w:hAnsi="Calibri"/>
-          <w:b w:val="false"/>
-          <w:strike w:val="false"/>
-          <w:dstrike w:val="false"/>
-          <w:color w:val="auto"/>
-          <w:sz w:val="20"/>
-          <w:szCs w:val="20"/>
-          <w:u w:val="none"/>
-        </w:rPr>
-      </w:pPr>
-      <w:r>
-        <w:rPr>
-          <w:b w:val="false"/>
-          <w:strike w:val="false"/>
-          <w:dstrike w:val="false"/>
-          <w:color w:val="auto"/>
-          <w:sz w:val="20"/>
-          <w:szCs w:val="20"/>
-          <w:u w:val="none"/>
-        </w:rPr>
-      </w:r>
-    </w:p>
-    <w:p>
-      <w:pPr>
-        <w:pStyle w:val="Default"/>
-        <w:tabs>
-          <w:tab w:val="clear" w:pos="720"/>
-          <w:tab w:val="left" w:pos="400" w:leader="none"/>
-        </w:tabs>
-        <w:bidi w:val="0"/>
-        <w:jc w:val="both"/>
-        <w:rPr>
-          <w:rFonts w:ascii="Calibri" w:hAnsi="Calibri"/>
-          <w:sz w:val="20"/>
-          <w:szCs w:val="20"/>
-        </w:rPr>
-      </w:pPr>
-      <w:r>
-        <w:rPr>
-          <w:b w:val="false"/>
-          <w:strike w:val="false"/>
-          <w:dstrike w:val="false"/>
-          <w:color w:val="auto"/>
-          <w:sz w:val="20"/>
-          <w:szCs w:val="20"/>
-          <w:u w:val="none"/>
-        </w:rPr>
-        <w:t>I refer to your letter:</w:t>
+          <w:b w:val="false"/>
+          <w:bCs w:val="false"/>
+          <w:strike w:val="false"/>
+          <w:dstrike w:val="false"/>
+          <w:color w:val="auto"/>
+          <w:sz w:val="20"/>
+          <w:szCs w:val="20"/>
+          <w:u w:val="none"/>
+        </w:rPr>
+      </w:pPr>
+      <w:r>
+        <w:rPr>
+          <w:b w:val="false"/>
+          <w:bCs w:val="false"/>
+          <w:strike w:val="false"/>
+          <w:dstrike w:val="false"/>
+          <w:color w:val="auto"/>
+          <w:sz w:val="20"/>
+          <w:szCs w:val="20"/>
+          <w:u w:val="none"/>
+        </w:rPr>
+        <w:t>In this regard, moving forward with the caption, please find enclosed:</w:t>
       </w:r>
     </w:p>
     <w:p>
@@ -553,154 +711,27 @@
         <w:rPr>
           <w:rFonts w:ascii="Calibri" w:hAnsi="Calibri"/>
           <w:b w:val="false"/>
-          <w:strike w:val="false"/>
-          <w:dstrike w:val="false"/>
-          <w:color w:val="auto"/>
-          <w:sz w:val="20"/>
-          <w:szCs w:val="20"/>
-          <w:u w:val="none"/>
-        </w:rPr>
-      </w:pPr>
-      <w:r>
-        <w:rPr>
-          <w:b w:val="false"/>
-          <w:strike w:val="false"/>
-          <w:dstrike w:val="false"/>
-          <w:color w:val="auto"/>
-          <w:sz w:val="20"/>
-          <w:szCs w:val="20"/>
-          <w:u w:val="none"/>
-        </w:rPr>
-        <w:fldChar w:fldCharType="begin"/>
-      </w:r>
-      <w:r>
-        <w:rPr>
-          <w:b w:val="false"/>
-          <w:strike w:val="false"/>
-          <w:dstrike w:val="false"/>
-          <w:color w:val="auto"/>
-          <w:sz w:val="20"/>
-          <w:szCs w:val="20"/>
-          <w:u w:val="none"/>
-        </w:rPr>
-        <w:instrText xml:space="preserve"> DOCPROPERTY "ReferenceSender"</w:instrText>
-      </w:r>
-      <w:r>
-        <w:rPr>
-          <w:b w:val="false"/>
-          <w:strike w:val="false"/>
-          <w:dstrike w:val="false"/>
-          <w:color w:val="auto"/>
-          <w:sz w:val="20"/>
-          <w:szCs w:val="20"/>
-          <w:u w:val="none"/>
-        </w:rPr>
-        <w:fldChar w:fldCharType="separate"/>
-      </w:r>
-      <w:r>
-        <w:rPr>
-          <w:b w:val="false"/>
-          <w:strike w:val="false"/>
-          <w:dstrike w:val="false"/>
-          <w:color w:val="auto"/>
-          <w:sz w:val="20"/>
-          <w:szCs w:val="20"/>
-          <w:u w:val="none"/>
-        </w:rPr>
-        <w:t>CDCSR/LTC/ATRL/1005/26</w:t>
-      </w:r>
-      <w:r>
-        <w:rPr>
-          <w:b w:val="false"/>
-          <w:strike w:val="false"/>
-          <w:dstrike w:val="false"/>
-          <w:color w:val="auto"/>
-          <w:sz w:val="20"/>
-          <w:szCs w:val="20"/>
-          <w:u w:val="none"/>
-        </w:rPr>
-        <w:fldChar w:fldCharType="end"/>
-      </w:r>
-      <w:r>
-        <w:rPr>
-          <w:b w:val="false"/>
-          <w:strike w:val="false"/>
-          <w:dstrike w:val="false"/>
-          <w:color w:val="auto"/>
-          <w:sz w:val="20"/>
-          <w:szCs w:val="20"/>
-          <w:u w:val="none"/>
-        </w:rPr>
-        <w:t>.</w:t>
-      </w:r>
-    </w:p>
-    <w:p>
-      <w:pPr>
-        <w:pStyle w:val="Default"/>
-        <w:tabs>
-          <w:tab w:val="clear" w:pos="720"/>
-          <w:tab w:val="left" w:pos="400" w:leader="none"/>
-        </w:tabs>
-        <w:bidi w:val="0"/>
-        <w:jc w:val="both"/>
-        <w:rPr>
-          <w:rFonts w:ascii="Calibri" w:hAnsi="Calibri"/>
-          <w:b w:val="false"/>
-          <w:bCs w:val="false"/>
-          <w:strike w:val="false"/>
-          <w:dstrike w:val="false"/>
-          <w:color w:val="auto"/>
-          <w:sz w:val="20"/>
-          <w:szCs w:val="20"/>
-          <w:u w:val="none"/>
-        </w:rPr>
-      </w:pPr>
-      <w:r>
-        <w:rPr>
-          <w:b w:val="false"/>
-          <w:bCs w:val="false"/>
-          <w:strike w:val="false"/>
-          <w:dstrike w:val="false"/>
-          <w:color w:val="auto"/>
-          <w:sz w:val="20"/>
-          <w:szCs w:val="20"/>
-          <w:u w:val="none"/>
-        </w:rPr>
-      </w:r>
-    </w:p>
-    <w:p>
-      <w:pPr>
-        <w:pStyle w:val="Default"/>
-        <w:tabs>
-          <w:tab w:val="clear" w:pos="720"/>
-          <w:tab w:val="left" w:pos="400" w:leader="none"/>
-        </w:tabs>
-        <w:bidi w:val="0"/>
-        <w:jc w:val="both"/>
-        <w:rPr>
-          <w:rFonts w:ascii="Calibri" w:hAnsi="Calibri"/>
-          <w:b w:val="false"/>
-          <w:bCs w:val="false"/>
-          <w:strike w:val="false"/>
-          <w:dstrike w:val="false"/>
-          <w:color w:val="auto"/>
-          <w:sz w:val="20"/>
-          <w:szCs w:val="20"/>
-          <w:u w:val="none"/>
-        </w:rPr>
-      </w:pPr>
-      <w:r>
-        <w:rPr>
-          <w:b w:val="false"/>
-          <w:bCs w:val="false"/>
-          <w:strike w:val="false"/>
-          <w:dstrike w:val="false"/>
-          <w:color w:val="auto"/>
-          <w:sz w:val="20"/>
-          <w:szCs w:val="20"/>
-          <w:u w:val="none"/>
-        </w:rPr>
-        <w:t>In this regard, moving forward with the caption, please find enclosed:</w:t>
+          <w:bCs w:val="false"/>
+          <w:strike w:val="false"/>
+          <w:dstrike w:val="false"/>
+          <w:color w:val="auto"/>
+          <w:sz w:val="20"/>
+          <w:szCs w:val="20"/>
+          <w:u w:val="none"/>
+        </w:rPr>
+      </w:pPr>
+      <w:r>
+        <w:rPr>
+          <w:b w:val="false"/>
+          <w:bCs w:val="false"/>
+          <w:strike w:val="false"/>
+          <w:dstrike w:val="false"/>
+          <w:color w:val="auto"/>
+          <w:sz w:val="20"/>
+          <w:szCs w:val="20"/>
+          <w:u w:val="none"/>
+        </w:rPr>
+        <w:t>Indemnity Bond on E-stamp paper of Rs.500/, duly signed by the legal heir, witnesses, guarantor and attested by Notary Public;</w:t>
       </w:r>
     </w:p>
     <w:p>
@@ -708,7 +739,7 @@
         <w:pStyle w:val="Default"/>
         <w:numPr>
           <w:ilvl w:val="0"/>
-          <w:numId w:val="5"/>
+          <w:numId w:val="4"/>
         </w:numPr>
         <w:tabs>
           <w:tab w:val="clear" w:pos="720"/>
@@ -739,7 +770,7 @@
           <w:szCs w:val="20"/>
           <w:u w:val="none"/>
         </w:rPr>
-        <w:t>Indemnity Bond on E-stamp paper of Rs.500/, duly signed by the legal heir, witnesses, guarantor and attested by Notary Public;</w:t>
+        <w:t>Legible copies of Computerized National Identity Cards (CNICs) of guarantor, and all the witnessing persons attested by the Notary Public.</w:t>
       </w:r>
     </w:p>
     <w:p>
@@ -747,7 +778,7 @@
         <w:pStyle w:val="Default"/>
         <w:numPr>
           <w:ilvl w:val="0"/>
-          <w:numId w:val="5"/>
+          <w:numId w:val="4"/>
         </w:numPr>
         <w:tabs>
           <w:tab w:val="clear" w:pos="720"/>
@@ -778,7 +809,551 @@
           <w:szCs w:val="20"/>
           <w:u w:val="none"/>
         </w:rPr>
-        <w:t>Legible copies of Computerized National Identity Cards (CNICs) of guarantor, and all the witnessing persons attested by the Notary Public.</w:t>
+        <w:t>Complete set of Public Notice notifying loss/misplacement of shares, published in Leading Newspaper:</w:t>
+      </w:r>
+    </w:p>
+    <w:p>
+      <w:pPr>
+        <w:pStyle w:val="Default"/>
+        <w:numPr>
+          <w:ilvl w:val="1"/>
+          <w:numId w:val="4"/>
+        </w:numPr>
+        <w:tabs>
+          <w:tab w:val="clear" w:pos="720"/>
+          <w:tab w:val="left" w:pos="400" w:leader="none"/>
+        </w:tabs>
+        <w:bidi w:val="0"/>
+        <w:jc w:val="both"/>
+        <w:rPr>
+          <w:rFonts w:ascii="Calibri" w:hAnsi="Calibri"/>
+          <w:b w:val="false"/>
+          <w:bCs w:val="false"/>
+          <w:strike w:val="false"/>
+          <w:dstrike w:val="false"/>
+          <w:color w:val="auto"/>
+          <w:sz w:val="20"/>
+          <w:szCs w:val="20"/>
+          <w:u w:val="none"/>
+        </w:rPr>
+      </w:pPr>
+      <w:r>
+        <w:rPr>
+          <w:b w:val="false"/>
+          <w:bCs w:val="false"/>
+          <w:strike w:val="false"/>
+          <w:dstrike w:val="false"/>
+          <w:color w:val="auto"/>
+          <w:sz w:val="20"/>
+          <w:szCs w:val="20"/>
+          <w:u w:val="none"/>
+        </w:rPr>
+        <w:t xml:space="preserve">English: The Nation, published on </w:t>
+      </w:r>
+      <w:r>
+        <w:rPr>
+          <w:b w:val="false"/>
+          <w:bCs w:val="false"/>
+          <w:strike w:val="false"/>
+          <w:dstrike w:val="false"/>
+          <w:color w:val="auto"/>
+          <w:sz w:val="20"/>
+          <w:szCs w:val="20"/>
+          <w:u w:val="none"/>
+        </w:rPr>
+        <w:fldChar w:fldCharType="begin"/>
+      </w:r>
+      <w:r>
+        <w:rPr>
+          <w:b w:val="false"/>
+          <w:bCs w:val="false"/>
+          <w:strike w:val="false"/>
+          <w:dstrike w:val="false"/>
+          <w:color w:val="auto"/>
+          <w:sz w:val="20"/>
+          <w:szCs w:val="20"/>
+          <w:u w:val="none"/>
+        </w:rPr>
+        <w:instrText xml:space="preserve"> DOCPROPERTY "NewsPaperDate"</w:instrText>
+      </w:r>
+      <w:r>
+        <w:rPr>
+          <w:b w:val="false"/>
+          <w:bCs w:val="false"/>
+          <w:strike w:val="false"/>
+          <w:dstrike w:val="false"/>
+          <w:color w:val="auto"/>
+          <w:sz w:val="20"/>
+          <w:szCs w:val="20"/>
+          <w:u w:val="none"/>
+        </w:rPr>
+        <w:fldChar w:fldCharType="separate"/>
+      </w:r>
+      <w:r>
+        <w:rPr>
+          <w:b w:val="false"/>
+          <w:bCs w:val="false"/>
+          <w:strike w:val="false"/>
+          <w:dstrike w:val="false"/>
+          <w:color w:val="auto"/>
+          <w:sz w:val="20"/>
+          <w:szCs w:val="20"/>
+          <w:u w:val="none"/>
+        </w:rPr>
+        <w:t>April 2, 2026</w:t>
+      </w:r>
+      <w:r>
+        <w:rPr>
+          <w:b w:val="false"/>
+          <w:bCs w:val="false"/>
+          <w:strike w:val="false"/>
+          <w:dstrike w:val="false"/>
+          <w:color w:val="auto"/>
+          <w:sz w:val="20"/>
+          <w:szCs w:val="20"/>
+          <w:u w:val="none"/>
+        </w:rPr>
+        <w:fldChar w:fldCharType="end"/>
+      </w:r>
+      <w:r>
+        <w:rPr>
+          <w:b w:val="false"/>
+          <w:bCs w:val="false"/>
+          <w:strike w:val="false"/>
+          <w:dstrike w:val="false"/>
+          <w:color w:val="auto"/>
+          <w:sz w:val="20"/>
+          <w:szCs w:val="20"/>
+          <w:u w:val="none"/>
+        </w:rPr>
+        <w:t xml:space="preserve">, </w:t>
+      </w:r>
+      <w:r>
+        <w:rPr>
+          <w:b w:val="false"/>
+          <w:bCs w:val="false"/>
+          <w:strike w:val="false"/>
+          <w:dstrike w:val="false"/>
+          <w:color w:val="auto"/>
+          <w:sz w:val="20"/>
+          <w:szCs w:val="20"/>
+          <w:u w:val="none"/>
+        </w:rPr>
+        <w:fldChar w:fldCharType="begin"/>
+      </w:r>
+      <w:r>
+        <w:rPr>
+          <w:b w:val="false"/>
+          <w:bCs w:val="false"/>
+          <w:strike w:val="false"/>
+          <w:dstrike w:val="false"/>
+          <w:color w:val="auto"/>
+          <w:sz w:val="20"/>
+          <w:szCs w:val="20"/>
+          <w:u w:val="none"/>
+        </w:rPr>
+        <w:instrText xml:space="preserve"> DOCPROPERTY "NewsPaperEng-colNr"</w:instrText>
+      </w:r>
+      <w:r>
+        <w:rPr>
+          <w:b w:val="false"/>
+          <w:bCs w:val="false"/>
+          <w:strike w:val="false"/>
+          <w:dstrike w:val="false"/>
+          <w:color w:val="auto"/>
+          <w:sz w:val="20"/>
+          <w:szCs w:val="20"/>
+          <w:u w:val="none"/>
+        </w:rPr>
+        <w:fldChar w:fldCharType="separate"/>
+      </w:r>
+      <w:r>
+        <w:rPr>
+          <w:b w:val="false"/>
+          <w:bCs w:val="false"/>
+          <w:strike w:val="false"/>
+          <w:dstrike w:val="false"/>
+          <w:color w:val="auto"/>
+          <w:sz w:val="20"/>
+          <w:szCs w:val="20"/>
+          <w:u w:val="none"/>
+        </w:rPr>
+        <w:t>page number 4, column number 4</w:t>
+      </w:r>
+      <w:r>
+        <w:rPr>
+          <w:b w:val="false"/>
+          <w:bCs w:val="false"/>
+          <w:strike w:val="false"/>
+          <w:dstrike w:val="false"/>
+          <w:color w:val="auto"/>
+          <w:sz w:val="20"/>
+          <w:szCs w:val="20"/>
+          <w:u w:val="none"/>
+        </w:rPr>
+        <w:fldChar w:fldCharType="end"/>
+      </w:r>
+      <w:r>
+        <w:rPr>
+          <w:b w:val="false"/>
+          <w:bCs w:val="false"/>
+          <w:strike w:val="false"/>
+          <w:dstrike w:val="false"/>
+          <w:color w:val="auto"/>
+          <w:sz w:val="20"/>
+          <w:szCs w:val="20"/>
+          <w:u w:val="none"/>
+        </w:rPr>
+        <w:t>; and</w:t>
+      </w:r>
+    </w:p>
+    <w:p>
+      <w:pPr>
+        <w:pStyle w:val="Default"/>
+        <w:numPr>
+          <w:ilvl w:val="1"/>
+          <w:numId w:val="4"/>
+        </w:numPr>
+        <w:tabs>
+          <w:tab w:val="clear" w:pos="720"/>
+          <w:tab w:val="left" w:pos="400" w:leader="none"/>
+        </w:tabs>
+        <w:bidi w:val="0"/>
+        <w:jc w:val="both"/>
+        <w:rPr>
+          <w:rFonts w:ascii="Calibri" w:hAnsi="Calibri"/>
+          <w:b w:val="false"/>
+          <w:bCs w:val="false"/>
+          <w:strike w:val="false"/>
+          <w:dstrike w:val="false"/>
+          <w:color w:val="auto"/>
+          <w:sz w:val="20"/>
+          <w:szCs w:val="20"/>
+          <w:u w:val="none"/>
+        </w:rPr>
+      </w:pPr>
+      <w:r>
+        <w:rPr>
+          <w:b w:val="false"/>
+          <w:bCs w:val="false"/>
+          <w:strike w:val="false"/>
+          <w:dstrike w:val="false"/>
+          <w:color w:val="auto"/>
+          <w:sz w:val="20"/>
+          <w:szCs w:val="20"/>
+          <w:u w:val="none"/>
+        </w:rPr>
+        <w:t xml:space="preserve">Urdu: </w:t>
+      </w:r>
+      <w:r>
+        <w:rPr>
+          <w:rFonts w:cs="Urdu Typesetting"/>
+          <w:b w:val="false"/>
+          <w:bCs w:val="false"/>
+          <w:strike w:val="false"/>
+          <w:dstrike w:val="false"/>
+          <w:color w:val="auto"/>
+          <w:sz w:val="28"/>
+          <w:szCs w:val="28"/>
+          <w:u w:val="none"/>
+        </w:rPr>
+        <w:fldChar w:fldCharType="begin"/>
+      </w:r>
+      <w:r>
+        <w:rPr>
+          <w:rFonts w:cs="Urdu Typesetting"/>
+          <w:b w:val="false"/>
+          <w:bCs w:val="false"/>
+          <w:strike w:val="false"/>
+          <w:dstrike w:val="false"/>
+          <w:color w:val="auto"/>
+          <w:sz w:val="28"/>
+          <w:szCs w:val="28"/>
+          <w:u w:val="none"/>
+        </w:rPr>
+        <w:instrText xml:space="preserve"> DOCPROPERTY "NewsPaperUrdu"</w:instrText>
+      </w:r>
+      <w:r>
+        <w:rPr>
+          <w:rFonts w:cs="Urdu Typesetting"/>
+          <w:b w:val="false"/>
+          <w:bCs w:val="false"/>
+          <w:strike w:val="false"/>
+          <w:dstrike w:val="false"/>
+          <w:color w:val="auto"/>
+          <w:sz w:val="28"/>
+          <w:szCs w:val="28"/>
+          <w:u w:val="none"/>
+        </w:rPr>
+        <w:fldChar w:fldCharType="separate"/>
+      </w:r>
+      <w:r>
+        <w:rPr>
+          <w:rFonts w:cs="Urdu Typesetting"/>
+          <w:b w:val="false"/>
+          <w:bCs w:val="false"/>
+          <w:strike w:val="false"/>
+          <w:dstrike w:val="false"/>
+          <w:color w:val="auto"/>
+          <w:sz w:val="28"/>
+          <w:szCs w:val="28"/>
+          <w:u w:val="none"/>
+        </w:rPr>
+        <w:t>روزنانہ ایکسپریس</w:t>
+      </w:r>
+      <w:r>
+        <w:rPr>
+          <w:rFonts w:cs="Urdu Typesetting"/>
+          <w:b w:val="false"/>
+          <w:bCs w:val="false"/>
+          <w:strike w:val="false"/>
+          <w:dstrike w:val="false"/>
+          <w:color w:val="auto"/>
+          <w:sz w:val="28"/>
+          <w:szCs w:val="28"/>
+          <w:u w:val="none"/>
+        </w:rPr>
+        <w:fldChar w:fldCharType="end"/>
+      </w:r>
+      <w:r>
+        <w:rPr>
+          <w:rFonts w:cs="Urdu Typesetting"/>
+          <w:b w:val="false"/>
+          <w:bCs w:val="false"/>
+          <w:strike w:val="false"/>
+          <w:dstrike w:val="false"/>
+          <w:color w:val="auto"/>
+          <w:sz w:val="28"/>
+          <w:szCs w:val="28"/>
+          <w:u w:val="none"/>
+        </w:rPr>
+        <w:t xml:space="preserve"> </w:t>
+      </w:r>
+      <w:r>
+        <w:rPr>
+          <w:rFonts w:cs="Urdu Typesetting"/>
+          <w:b w:val="false"/>
+          <w:bCs w:val="false"/>
+          <w:strike w:val="false"/>
+          <w:dstrike w:val="false"/>
+          <w:color w:val="auto"/>
+          <w:sz w:val="20"/>
+          <w:szCs w:val="20"/>
+          <w:u w:val="none"/>
+        </w:rPr>
+        <w:t>published</w:t>
+      </w:r>
+      <w:r>
+        <w:rPr>
+          <w:b w:val="false"/>
+          <w:bCs w:val="false"/>
+          <w:strike w:val="false"/>
+          <w:dstrike w:val="false"/>
+          <w:color w:val="auto"/>
+          <w:sz w:val="20"/>
+          <w:szCs w:val="20"/>
+          <w:u w:val="none"/>
+        </w:rPr>
+        <w:t xml:space="preserve"> on </w:t>
+      </w:r>
+      <w:r>
+        <w:rPr>
+          <w:b w:val="false"/>
+          <w:bCs w:val="false"/>
+          <w:strike w:val="false"/>
+          <w:dstrike w:val="false"/>
+          <w:color w:val="auto"/>
+          <w:sz w:val="20"/>
+          <w:szCs w:val="20"/>
+          <w:u w:val="none"/>
+        </w:rPr>
+        <w:fldChar w:fldCharType="begin"/>
+      </w:r>
+      <w:r>
+        <w:rPr>
+          <w:b w:val="false"/>
+          <w:bCs w:val="false"/>
+          <w:strike w:val="false"/>
+          <w:dstrike w:val="false"/>
+          <w:color w:val="auto"/>
+          <w:sz w:val="20"/>
+          <w:szCs w:val="20"/>
+          <w:u w:val="none"/>
+        </w:rPr>
+        <w:instrText xml:space="preserve"> DOCPROPERTY "NewsPaperDate"</w:instrText>
+      </w:r>
+      <w:r>
+        <w:rPr>
+          <w:b w:val="false"/>
+          <w:bCs w:val="false"/>
+          <w:strike w:val="false"/>
+          <w:dstrike w:val="false"/>
+          <w:color w:val="auto"/>
+          <w:sz w:val="20"/>
+          <w:szCs w:val="20"/>
+          <w:u w:val="none"/>
+        </w:rPr>
+        <w:fldChar w:fldCharType="separate"/>
+      </w:r>
+      <w:r>
+        <w:rPr>
+          <w:b w:val="false"/>
+          <w:bCs w:val="false"/>
+          <w:strike w:val="false"/>
+          <w:dstrike w:val="false"/>
+          <w:color w:val="auto"/>
+          <w:sz w:val="20"/>
+          <w:szCs w:val="20"/>
+          <w:u w:val="none"/>
+        </w:rPr>
+        <w:t>April 2, 2026</w:t>
+      </w:r>
+      <w:r>
+        <w:rPr>
+          <w:b w:val="false"/>
+          <w:bCs w:val="false"/>
+          <w:strike w:val="false"/>
+          <w:dstrike w:val="false"/>
+          <w:color w:val="auto"/>
+          <w:sz w:val="20"/>
+          <w:szCs w:val="20"/>
+          <w:u w:val="none"/>
+        </w:rPr>
+        <w:fldChar w:fldCharType="end"/>
+      </w:r>
+      <w:r>
+        <w:rPr>
+          <w:b w:val="false"/>
+          <w:bCs w:val="false"/>
+          <w:strike w:val="false"/>
+          <w:dstrike w:val="false"/>
+          <w:color w:val="auto"/>
+          <w:sz w:val="20"/>
+          <w:szCs w:val="20"/>
+          <w:u w:val="none"/>
+        </w:rPr>
+        <w:t xml:space="preserve">, </w:t>
+      </w:r>
+      <w:r>
+        <w:rPr>
+          <w:b w:val="false"/>
+          <w:bCs w:val="false"/>
+          <w:strike w:val="false"/>
+          <w:dstrike w:val="false"/>
+          <w:color w:val="auto"/>
+          <w:sz w:val="20"/>
+          <w:szCs w:val="20"/>
+          <w:u w:val="none"/>
+        </w:rPr>
+        <w:fldChar w:fldCharType="begin"/>
+      </w:r>
+      <w:r>
+        <w:rPr>
+          <w:b w:val="false"/>
+          <w:bCs w:val="false"/>
+          <w:strike w:val="false"/>
+          <w:dstrike w:val="false"/>
+          <w:color w:val="auto"/>
+          <w:sz w:val="20"/>
+          <w:szCs w:val="20"/>
+          <w:u w:val="none"/>
+        </w:rPr>
+        <w:instrText xml:space="preserve"> DOCPROPERTY "NewsPaperUrdu-colNr"</w:instrText>
+      </w:r>
+      <w:r>
+        <w:rPr>
+          <w:b w:val="false"/>
+          <w:bCs w:val="false"/>
+          <w:strike w:val="false"/>
+          <w:dstrike w:val="false"/>
+          <w:color w:val="auto"/>
+          <w:sz w:val="20"/>
+          <w:szCs w:val="20"/>
+          <w:u w:val="none"/>
+        </w:rPr>
+        <w:fldChar w:fldCharType="separate"/>
+      </w:r>
+      <w:r>
+        <w:rPr>
+          <w:b w:val="false"/>
+          <w:bCs w:val="false"/>
+          <w:strike w:val="false"/>
+          <w:dstrike w:val="false"/>
+          <w:color w:val="auto"/>
+          <w:sz w:val="20"/>
+          <w:szCs w:val="20"/>
+          <w:u w:val="none"/>
+        </w:rPr>
+        <w:t>page number 4, column number 2</w:t>
+      </w:r>
+      <w:r>
+        <w:rPr>
+          <w:b w:val="false"/>
+          <w:bCs w:val="false"/>
+          <w:strike w:val="false"/>
+          <w:dstrike w:val="false"/>
+          <w:color w:val="auto"/>
+          <w:sz w:val="20"/>
+          <w:szCs w:val="20"/>
+          <w:u w:val="none"/>
+        </w:rPr>
+        <w:fldChar w:fldCharType="end"/>
+      </w:r>
+      <w:r>
+        <w:rPr>
+          <w:b w:val="false"/>
+          <w:bCs w:val="false"/>
+          <w:strike w:val="false"/>
+          <w:dstrike w:val="false"/>
+          <w:color w:val="auto"/>
+          <w:sz w:val="20"/>
+          <w:szCs w:val="20"/>
+          <w:u w:val="none"/>
+        </w:rPr>
+        <w:t xml:space="preserve"> under </w:t>
+      </w:r>
+      <w:r>
+        <w:rPr>
+          <w:rFonts w:cs="Urdu Typesetting"/>
+          <w:b w:val="false"/>
+          <w:b w:val="false"/>
+          <w:bCs w:val="false"/>
+          <w:strike w:val="false"/>
+          <w:dstrike w:val="false"/>
+          <w:color w:val="auto"/>
+          <w:sz w:val="28"/>
+          <w:szCs w:val="28"/>
+          <w:u w:val="none"/>
+          <w:rtl w:val="true"/>
+        </w:rPr>
+        <w:t>کلاسیفائڈ</w:t>
+      </w:r>
+      <w:r>
+        <w:rPr>
+          <w:b w:val="false"/>
+          <w:b w:val="false"/>
+          <w:bCs w:val="false"/>
+          <w:strike w:val="false"/>
+          <w:dstrike w:val="false"/>
+          <w:color w:val="auto"/>
+          <w:sz w:val="20"/>
+          <w:szCs w:val="20"/>
+          <w:u w:val="none"/>
+        </w:rPr>
+        <w:t xml:space="preserve"> </w:t>
+      </w:r>
+      <w:r>
+        <w:rPr>
+          <w:b w:val="false"/>
+          <w:bCs w:val="false"/>
+          <w:strike w:val="false"/>
+          <w:dstrike w:val="false"/>
+          <w:color w:val="auto"/>
+          <w:sz w:val="20"/>
+          <w:szCs w:val="20"/>
+          <w:u w:val="none"/>
+        </w:rPr>
+        <w:t>section;</w:t>
       </w:r>
     </w:p>
     <w:p>
@@ -786,7 +1361,7 @@
         <w:pStyle w:val="Default"/>
         <w:numPr>
           <w:ilvl w:val="0"/>
-          <w:numId w:val="5"/>
+          <w:numId w:val="4"/>
         </w:numPr>
         <w:tabs>
           <w:tab w:val="clear" w:pos="720"/>
@@ -817,642 +1392,7 @@
           <w:szCs w:val="20"/>
           <w:u w:val="none"/>
         </w:rPr>
-        <w:t>Complete set of Public Notice notifying loss/misplacement of shares, published in Leading Newspaper:</w:t>
-      </w:r>
-    </w:p>
-    <w:p>
-      <w:pPr>
-        <w:pStyle w:val="Default"/>
-        <w:numPr>
-          <w:ilvl w:val="1"/>
-          <w:numId w:val="5"/>
-        </w:numPr>
-        <w:tabs>
-          <w:tab w:val="clear" w:pos="720"/>
-          <w:tab w:val="left" w:pos="400" w:leader="none"/>
-        </w:tabs>
-        <w:bidi w:val="0"/>
-        <w:jc w:val="both"/>
-        <w:rPr>
-          <w:rFonts w:ascii="Calibri" w:hAnsi="Calibri"/>
-          <w:b w:val="false"/>
-          <w:bCs w:val="false"/>
-          <w:strike w:val="false"/>
-          <w:dstrike w:val="false"/>
-          <w:color w:val="auto"/>
-          <w:sz w:val="20"/>
-          <w:szCs w:val="20"/>
-          <w:u w:val="none"/>
-        </w:rPr>
-      </w:pPr>
-      <w:r>
-        <w:rPr>
-          <w:b w:val="false"/>
-          <w:bCs w:val="false"/>
-          <w:strike w:val="false"/>
-          <w:dstrike w:val="false"/>
-          <w:color w:val="auto"/>
-          <w:sz w:val="20"/>
-          <w:szCs w:val="20"/>
-          <w:u w:val="none"/>
-        </w:rPr>
-        <w:t xml:space="preserve">English: The Nation, </w:t>
-      </w:r>
-      <w:r>
-        <w:rPr>
-          <w:b w:val="false"/>
-          <w:bCs w:val="false"/>
-          <w:strike w:val="false"/>
-          <w:dstrike w:val="false"/>
-          <w:color w:val="auto"/>
-          <w:sz w:val="20"/>
-          <w:szCs w:val="20"/>
-          <w:u w:val="none"/>
-        </w:rPr>
-        <w:t>published on</w:t>
-      </w:r>
-      <w:r>
-        <w:rPr>
-          <w:b w:val="false"/>
-          <w:bCs w:val="false"/>
-          <w:strike w:val="false"/>
-          <w:dstrike w:val="false"/>
-          <w:color w:val="auto"/>
-          <w:sz w:val="20"/>
-          <w:szCs w:val="20"/>
-          <w:u w:val="none"/>
-        </w:rPr>
-        <w:t xml:space="preserve"> </w:t>
-      </w:r>
-      <w:r>
-        <w:rPr>
-          <w:b w:val="false"/>
-          <w:bCs w:val="false"/>
-          <w:strike w:val="false"/>
-          <w:dstrike w:val="false"/>
-          <w:color w:val="auto"/>
-          <w:sz w:val="20"/>
-          <w:szCs w:val="20"/>
-          <w:u w:val="none"/>
-        </w:rPr>
-        <w:fldChar w:fldCharType="begin"/>
-      </w:r>
-      <w:r>
-        <w:rPr>
-          <w:b w:val="false"/>
-          <w:bCs w:val="false"/>
-          <w:strike w:val="false"/>
-          <w:dstrike w:val="false"/>
-          <w:color w:val="auto"/>
-          <w:sz w:val="20"/>
-          <w:szCs w:val="20"/>
-          <w:u w:val="none"/>
-        </w:rPr>
-        <w:instrText xml:space="preserve"> DOCPROPERTY "NewsPaperDate"</w:instrText>
-      </w:r>
-      <w:r>
-        <w:rPr>
-          <w:b w:val="false"/>
-          <w:bCs w:val="false"/>
-          <w:strike w:val="false"/>
-          <w:dstrike w:val="false"/>
-          <w:color w:val="auto"/>
-          <w:sz w:val="20"/>
-          <w:szCs w:val="20"/>
-          <w:u w:val="none"/>
-        </w:rPr>
-        <w:fldChar w:fldCharType="separate"/>
-      </w:r>
-      <w:r>
-        <w:rPr>
-          <w:b w:val="false"/>
-          <w:bCs w:val="false"/>
-          <w:strike w:val="false"/>
-          <w:dstrike w:val="false"/>
-          <w:color w:val="auto"/>
-          <w:sz w:val="20"/>
-          <w:szCs w:val="20"/>
-          <w:u w:val="none"/>
-        </w:rPr>
-        <w:t>April 2, 2026</w:t>
-      </w:r>
-      <w:r>
-        <w:rPr>
-          <w:b w:val="false"/>
-          <w:bCs w:val="false"/>
-          <w:strike w:val="false"/>
-          <w:dstrike w:val="false"/>
-          <w:color w:val="auto"/>
-          <w:sz w:val="20"/>
-          <w:szCs w:val="20"/>
-          <w:u w:val="none"/>
-        </w:rPr>
-        <w:fldChar w:fldCharType="end"/>
-      </w:r>
-      <w:r>
-        <w:rPr>
-          <w:b w:val="false"/>
-          <w:bCs w:val="false"/>
-          <w:strike w:val="false"/>
-          <w:dstrike w:val="false"/>
-          <w:color w:val="auto"/>
-          <w:sz w:val="20"/>
-          <w:szCs w:val="20"/>
-          <w:u w:val="none"/>
-        </w:rPr>
-        <w:t xml:space="preserve">, </w:t>
-      </w:r>
-      <w:r>
-        <w:rPr>
-          <w:b w:val="false"/>
-          <w:bCs w:val="false"/>
-          <w:strike w:val="false"/>
-          <w:dstrike w:val="false"/>
-          <w:color w:val="auto"/>
-          <w:sz w:val="20"/>
-          <w:szCs w:val="20"/>
-          <w:u w:val="none"/>
-        </w:rPr>
-        <w:fldChar w:fldCharType="begin"/>
-      </w:r>
-      <w:r>
-        <w:rPr>
-          <w:b w:val="false"/>
-          <w:bCs w:val="false"/>
-          <w:strike w:val="false"/>
-          <w:dstrike w:val="false"/>
-          <w:color w:val="auto"/>
-          <w:sz w:val="20"/>
-          <w:szCs w:val="20"/>
-          <w:u w:val="none"/>
-        </w:rPr>
-        <w:instrText xml:space="preserve"> DOCPROPERTY "NewsPaperEng-colNr"</w:instrText>
-      </w:r>
-      <w:r>
-        <w:rPr>
-          <w:b w:val="false"/>
-          <w:bCs w:val="false"/>
-          <w:strike w:val="false"/>
-          <w:dstrike w:val="false"/>
-          <w:color w:val="auto"/>
-          <w:sz w:val="20"/>
-          <w:szCs w:val="20"/>
-          <w:u w:val="none"/>
-        </w:rPr>
-        <w:fldChar w:fldCharType="separate"/>
-      </w:r>
-      <w:r>
-        <w:rPr>
-          <w:b w:val="false"/>
-          <w:bCs w:val="false"/>
-          <w:strike w:val="false"/>
-          <w:dstrike w:val="false"/>
-          <w:color w:val="auto"/>
-          <w:sz w:val="20"/>
-          <w:szCs w:val="20"/>
-          <w:u w:val="none"/>
-        </w:rPr>
-        <w:t>page number 4, column number 4</w:t>
-      </w:r>
-      <w:r>
-        <w:rPr>
-          <w:b w:val="false"/>
-          <w:bCs w:val="false"/>
-          <w:strike w:val="false"/>
-          <w:dstrike w:val="false"/>
-          <w:color w:val="auto"/>
-          <w:sz w:val="20"/>
-          <w:szCs w:val="20"/>
-          <w:u w:val="none"/>
-        </w:rPr>
-        <w:fldChar w:fldCharType="end"/>
-      </w:r>
-      <w:r>
-        <w:rPr>
-          <w:b w:val="false"/>
-          <w:bCs w:val="false"/>
-          <w:strike w:val="false"/>
-          <w:dstrike w:val="false"/>
-          <w:color w:val="auto"/>
-          <w:sz w:val="20"/>
-          <w:szCs w:val="20"/>
-          <w:u w:val="none"/>
-        </w:rPr>
-        <w:t>; and</w:t>
-      </w:r>
-    </w:p>
-    <w:p>
-      <w:pPr>
-        <w:pStyle w:val="Default"/>
-        <w:numPr>
-          <w:ilvl w:val="1"/>
-          <w:numId w:val="5"/>
-        </w:numPr>
-        <w:tabs>
-          <w:tab w:val="clear" w:pos="720"/>
-          <w:tab w:val="left" w:pos="400" w:leader="none"/>
-        </w:tabs>
-        <w:bidi w:val="0"/>
-        <w:jc w:val="both"/>
-        <w:rPr>
-          <w:rFonts w:ascii="Calibri" w:hAnsi="Calibri"/>
-          <w:b w:val="false"/>
-          <w:bCs w:val="false"/>
-          <w:strike w:val="false"/>
-          <w:dstrike w:val="false"/>
-          <w:color w:val="auto"/>
-          <w:sz w:val="20"/>
-          <w:szCs w:val="20"/>
-          <w:u w:val="none"/>
-        </w:rPr>
-      </w:pPr>
-      <w:r>
-        <w:rPr>
-          <w:b w:val="false"/>
-          <w:bCs w:val="false"/>
-          <w:strike w:val="false"/>
-          <w:dstrike w:val="false"/>
-          <w:color w:val="auto"/>
-          <w:sz w:val="20"/>
-          <w:szCs w:val="20"/>
-          <w:u w:val="none"/>
-        </w:rPr>
-        <w:t xml:space="preserve">Urdu: </w:t>
-      </w:r>
-      <w:r>
-        <w:rPr>
-          <w:rFonts w:cs="Urdu Typesetting"/>
-          <w:b w:val="false"/>
-          <w:bCs w:val="false"/>
-          <w:strike w:val="false"/>
-          <w:dstrike w:val="false"/>
-          <w:color w:val="auto"/>
-          <w:sz w:val="28"/>
-          <w:szCs w:val="28"/>
-          <w:u w:val="none"/>
-        </w:rPr>
-        <w:fldChar w:fldCharType="begin"/>
-      </w:r>
-      <w:r>
-        <w:rPr>
-          <w:rFonts w:cs="Urdu Typesetting"/>
-          <w:b w:val="false"/>
-          <w:bCs w:val="false"/>
-          <w:strike w:val="false"/>
-          <w:dstrike w:val="false"/>
-          <w:color w:val="auto"/>
-          <w:sz w:val="28"/>
-          <w:szCs w:val="28"/>
-          <w:u w:val="none"/>
-        </w:rPr>
-        <w:instrText xml:space="preserve"> DOCPROPERTY "NewsPaperUrdu"</w:instrText>
-      </w:r>
-      <w:r>
-        <w:rPr>
-          <w:rFonts w:cs="Urdu Typesetting"/>
-          <w:b w:val="false"/>
-          <w:bCs w:val="false"/>
-          <w:strike w:val="false"/>
-          <w:dstrike w:val="false"/>
-          <w:color w:val="auto"/>
-          <w:sz w:val="28"/>
-          <w:szCs w:val="28"/>
-          <w:u w:val="none"/>
-        </w:rPr>
-        <w:fldChar w:fldCharType="separate"/>
-      </w:r>
-      <w:r>
-        <w:rPr>
-          <w:rFonts w:cs="Urdu Typesetting"/>
-          <w:b w:val="false"/>
-          <w:bCs w:val="false"/>
-          <w:strike w:val="false"/>
-          <w:dstrike w:val="false"/>
-          <w:color w:val="auto"/>
-          <w:sz w:val="28"/>
-          <w:szCs w:val="28"/>
-          <w:u w:val="none"/>
-        </w:rPr>
-        <w:t>روزنانہ ایکسپریس</w:t>
-      </w:r>
-      <w:r>
-        <w:rPr>
-          <w:rFonts w:cs="Urdu Typesetting"/>
-          <w:b w:val="false"/>
-          <w:bCs w:val="false"/>
-          <w:strike w:val="false"/>
-          <w:dstrike w:val="false"/>
-          <w:color w:val="auto"/>
-          <w:sz w:val="28"/>
-          <w:szCs w:val="28"/>
-          <w:u w:val="none"/>
-        </w:rPr>
-        <w:fldChar w:fldCharType="end"/>
-      </w:r>
-      <w:r>
-        <w:rPr>
-          <w:rFonts w:cs="Urdu Typesetting"/>
-          <w:b w:val="false"/>
-          <w:bCs w:val="false"/>
-          <w:strike w:val="false"/>
-          <w:dstrike w:val="false"/>
-          <w:color w:val="auto"/>
-          <w:sz w:val="28"/>
-          <w:szCs w:val="28"/>
-          <w:u w:val="none"/>
-        </w:rPr>
-        <w:t xml:space="preserve"> </w:t>
-      </w:r>
-      <w:r>
-        <w:rPr>
-          <w:rFonts w:cs="Urdu Typesetting"/>
-          <w:b w:val="false"/>
-          <w:bCs w:val="false"/>
-          <w:strike w:val="false"/>
-          <w:dstrike w:val="false"/>
-          <w:color w:val="auto"/>
-          <w:sz w:val="20"/>
-          <w:szCs w:val="20"/>
-          <w:u w:val="none"/>
-        </w:rPr>
-        <w:t>published</w:t>
-      </w:r>
-      <w:r>
-        <w:rPr>
-          <w:b w:val="false"/>
-          <w:bCs w:val="false"/>
-          <w:strike w:val="false"/>
-          <w:dstrike w:val="false"/>
-          <w:color w:val="auto"/>
-          <w:sz w:val="20"/>
-          <w:szCs w:val="20"/>
-          <w:u w:val="none"/>
-        </w:rPr>
-        <w:t xml:space="preserve"> on </w:t>
-      </w:r>
-      <w:r>
-        <w:rPr>
-          <w:b w:val="false"/>
-          <w:bCs w:val="false"/>
-          <w:strike w:val="false"/>
-          <w:dstrike w:val="false"/>
-          <w:color w:val="auto"/>
-          <w:sz w:val="20"/>
-          <w:szCs w:val="20"/>
-          <w:u w:val="none"/>
-        </w:rPr>
-        <w:fldChar w:fldCharType="begin"/>
-      </w:r>
-      <w:r>
-        <w:rPr>
-          <w:b w:val="false"/>
-          <w:bCs w:val="false"/>
-          <w:strike w:val="false"/>
-          <w:dstrike w:val="false"/>
-          <w:color w:val="auto"/>
-          <w:sz w:val="20"/>
-          <w:szCs w:val="20"/>
-          <w:u w:val="none"/>
-        </w:rPr>
-        <w:instrText xml:space="preserve"> DOCPROPERTY "NewsPaperDate"</w:instrText>
-      </w:r>
-      <w:r>
-        <w:rPr>
-          <w:b w:val="false"/>
-          <w:bCs w:val="false"/>
-          <w:strike w:val="false"/>
-          <w:dstrike w:val="false"/>
-          <w:color w:val="auto"/>
-          <w:sz w:val="20"/>
-          <w:szCs w:val="20"/>
-          <w:u w:val="none"/>
-        </w:rPr>
-        <w:fldChar w:fldCharType="separate"/>
-      </w:r>
-      <w:r>
-        <w:rPr>
-          <w:b w:val="false"/>
-          <w:bCs w:val="false"/>
-          <w:strike w:val="false"/>
-          <w:dstrike w:val="false"/>
-          <w:color w:val="auto"/>
-          <w:sz w:val="20"/>
-          <w:szCs w:val="20"/>
-          <w:u w:val="none"/>
-        </w:rPr>
-        <w:t>April 2, 2026</w:t>
-      </w:r>
-      <w:r>
-        <w:rPr>
-          <w:b w:val="false"/>
-          <w:bCs w:val="false"/>
-          <w:strike w:val="false"/>
-          <w:dstrike w:val="false"/>
-          <w:color w:val="auto"/>
-          <w:sz w:val="20"/>
-          <w:szCs w:val="20"/>
-          <w:u w:val="none"/>
-        </w:rPr>
-        <w:fldChar w:fldCharType="end"/>
-      </w:r>
-      <w:r>
-        <w:rPr>
-          <w:b w:val="false"/>
-          <w:bCs w:val="false"/>
-          <w:strike w:val="false"/>
-          <w:dstrike w:val="false"/>
-          <w:color w:val="auto"/>
-          <w:sz w:val="20"/>
-          <w:szCs w:val="20"/>
-          <w:u w:val="none"/>
-        </w:rPr>
-        <w:t xml:space="preserve">, </w:t>
-      </w:r>
-      <w:r>
-        <w:rPr>
-          <w:b w:val="false"/>
-          <w:bCs w:val="false"/>
-          <w:strike w:val="false"/>
-          <w:dstrike w:val="false"/>
-          <w:color w:val="auto"/>
-          <w:sz w:val="20"/>
-          <w:szCs w:val="20"/>
-          <w:u w:val="none"/>
-        </w:rPr>
-        <w:fldChar w:fldCharType="begin"/>
-      </w:r>
-      <w:r>
-        <w:rPr>
-          <w:b w:val="false"/>
-          <w:bCs w:val="false"/>
-          <w:strike w:val="false"/>
-          <w:dstrike w:val="false"/>
-          <w:color w:val="auto"/>
-          <w:sz w:val="20"/>
-          <w:szCs w:val="20"/>
-          <w:u w:val="none"/>
-        </w:rPr>
-        <w:instrText xml:space="preserve"> DOCPROPERTY "NewsPaperUrdu-colNr"</w:instrText>
-      </w:r>
-      <w:r>
-        <w:rPr>
-          <w:b w:val="false"/>
-          <w:bCs w:val="false"/>
-          <w:strike w:val="false"/>
-          <w:dstrike w:val="false"/>
-          <w:color w:val="auto"/>
-          <w:sz w:val="20"/>
-          <w:szCs w:val="20"/>
-          <w:u w:val="none"/>
-        </w:rPr>
-        <w:fldChar w:fldCharType="separate"/>
-      </w:r>
-      <w:r>
-        <w:rPr>
-          <w:b w:val="false"/>
-          <w:bCs w:val="false"/>
-          <w:strike w:val="false"/>
-          <w:dstrike w:val="false"/>
-          <w:color w:val="auto"/>
-          <w:sz w:val="20"/>
-          <w:szCs w:val="20"/>
-          <w:u w:val="none"/>
-        </w:rPr>
-        <w:t>page number 4, column number 2</w:t>
-      </w:r>
-      <w:r>
-        <w:rPr>
-          <w:b w:val="false"/>
-          <w:bCs w:val="false"/>
-          <w:strike w:val="false"/>
-          <w:dstrike w:val="false"/>
-          <w:color w:val="auto"/>
-          <w:sz w:val="20"/>
-          <w:szCs w:val="20"/>
-          <w:u w:val="none"/>
-        </w:rPr>
-        <w:fldChar w:fldCharType="end"/>
-      </w:r>
-      <w:r>
-        <w:rPr>
-          <w:b w:val="false"/>
-          <w:bCs w:val="false"/>
-          <w:strike w:val="false"/>
-          <w:dstrike w:val="false"/>
-          <w:color w:val="auto"/>
-          <w:sz w:val="20"/>
-          <w:szCs w:val="20"/>
-          <w:u w:val="none"/>
-        </w:rPr>
-        <w:t xml:space="preserve"> under </w:t>
-      </w:r>
-      <w:r>
-        <w:rPr>
-          <w:rFonts w:cs="Urdu Typesetting"/>
-          <w:b w:val="false"/>
-          <w:b w:val="false"/>
-          <w:bCs w:val="false"/>
-          <w:strike w:val="false"/>
-          <w:dstrike w:val="false"/>
-          <w:color w:val="auto"/>
-          <w:sz w:val="28"/>
-          <w:szCs w:val="28"/>
-          <w:u w:val="none"/>
-          <w:rtl w:val="true"/>
-        </w:rPr>
-        <w:t>کلاسیفائڈ</w:t>
-      </w:r>
-      <w:r>
-        <w:rPr>
-          <w:b w:val="false"/>
-          <w:b w:val="false"/>
-          <w:bCs w:val="false"/>
-          <w:strike w:val="false"/>
-          <w:dstrike w:val="false"/>
-          <w:color w:val="auto"/>
-          <w:sz w:val="20"/>
-          <w:szCs w:val="20"/>
-          <w:u w:val="none"/>
-        </w:rPr>
-        <w:t xml:space="preserve"> </w:t>
-      </w:r>
-      <w:r>
-        <w:rPr>
-          <w:b w:val="false"/>
-          <w:bCs w:val="false"/>
-          <w:strike w:val="false"/>
-          <w:dstrike w:val="false"/>
-          <w:color w:val="auto"/>
-          <w:sz w:val="20"/>
-          <w:szCs w:val="20"/>
-          <w:u w:val="none"/>
-        </w:rPr>
-        <w:t>section;</w:t>
-      </w:r>
-    </w:p>
-    <w:p>
-      <w:pPr>
-        <w:pStyle w:val="Default"/>
-        <w:numPr>
-          <w:ilvl w:val="0"/>
-          <w:numId w:val="5"/>
-        </w:numPr>
-        <w:tabs>
-          <w:tab w:val="clear" w:pos="720"/>
-          <w:tab w:val="left" w:pos="400" w:leader="none"/>
-        </w:tabs>
-        <w:bidi w:val="0"/>
-        <w:jc w:val="both"/>
-        <w:rPr>
-          <w:rFonts w:ascii="Calibri" w:hAnsi="Calibri"/>
-          <w:b w:val="false"/>
-          <w:bCs w:val="false"/>
-          <w:strike w:val="false"/>
-          <w:dstrike w:val="false"/>
-          <w:color w:val="auto"/>
-          <w:sz w:val="20"/>
-          <w:szCs w:val="20"/>
-          <w:u w:val="none"/>
-        </w:rPr>
-      </w:pPr>
-      <w:r>
-        <w:rPr>
-          <w:b w:val="false"/>
-          <w:bCs w:val="false"/>
-          <w:strike w:val="false"/>
-          <w:dstrike w:val="false"/>
-          <w:color w:val="auto"/>
-          <w:sz w:val="20"/>
-          <w:szCs w:val="20"/>
-          <w:u w:val="none"/>
-        </w:rPr>
-        <w:t xml:space="preserve">Revenue Stamps of Rs. </w:t>
-      </w:r>
-      <w:r>
-        <w:rPr>
-          <w:b w:val="false"/>
-          <w:bCs w:val="false"/>
-          <w:strike w:val="false"/>
-          <w:dstrike w:val="false"/>
-          <w:color w:val="auto"/>
-          <w:sz w:val="20"/>
-          <w:szCs w:val="20"/>
-          <w:u w:val="none"/>
-        </w:rPr>
-        <w:t>10</w:t>
-      </w:r>
-      <w:r>
-        <w:rPr>
-          <w:b w:val="false"/>
-          <w:bCs w:val="false"/>
-          <w:strike w:val="false"/>
-          <w:dstrike w:val="false"/>
-          <w:color w:val="auto"/>
-          <w:sz w:val="20"/>
-          <w:szCs w:val="20"/>
-          <w:u w:val="none"/>
-        </w:rPr>
-        <w:t>0/-.</w:t>
+        <w:t>Revenue Stamps of Rs. 100/-.</w:t>
       </w:r>
     </w:p>
     <w:p>
@@ -1912,7 +1852,10 @@
               </w:rPr>
             </w:pPr>
             <w:r>
-              <w:rPr/>
+              <w:rPr>
+                <w:sz w:val="20"/>
+                <w:szCs w:val="20"/>
+              </w:rPr>
             </w:r>
           </w:p>
           <w:p>
@@ -2758,7 +2701,7 @@
       <w:start w:val="1"/>
       <w:numFmt w:val="none"/>
       <w:suff w:val="nothing"/>
-      <w:lvlText w:val=""/>
+      <w:lvlText w:val="%1"/>
       <w:lvlJc w:val="start"/>
       <w:pPr>
         <w:tabs>
@@ -2766,8 +2709,480 @@
         </w:tabs>
         <w:ind w:start="0" w:hanging="0"/>
       </w:pPr>
+      <w:rPr/>
     </w:lvl>
     <w:lvl w:ilvl="1">
+      <w:start w:val="1"/>
+      <w:numFmt w:val="none"/>
+      <w:suff w:val="nothing"/>
+      <w:lvlText w:val="%2"/>
+      <w:lvlJc w:val="start"/>
+      <w:pPr>
+        <w:tabs>
+          <w:tab w:val="num" w:pos="0"/>
+        </w:tabs>
+        <w:ind w:start="0" w:hanging="0"/>
+      </w:pPr>
+      <w:rPr/>
+    </w:lvl>
+    <w:lvl w:ilvl="2">
+      <w:start w:val="1"/>
+      <w:numFmt w:val="none"/>
+      <w:suff w:val="nothing"/>
+      <w:lvlText w:val="%3"/>
+      <w:lvlJc w:val="start"/>
+      <w:pPr>
+        <w:tabs>
+          <w:tab w:val="num" w:pos="0"/>
+        </w:tabs>
+        <w:ind w:start="0" w:hanging="0"/>
+      </w:pPr>
+      <w:rPr/>
+    </w:lvl>
+    <w:lvl w:ilvl="3">
+      <w:start w:val="1"/>
+      <w:numFmt w:val="none"/>
+      <w:suff w:val="nothing"/>
+      <w:lvlText w:val="%4"/>
+      <w:lvlJc w:val="start"/>
+      <w:pPr>
+        <w:tabs>
+          <w:tab w:val="num" w:pos="0"/>
+        </w:tabs>
+        <w:ind w:start="0" w:hanging="0"/>
+      </w:pPr>
+      <w:rPr/>
+    </w:lvl>
+    <w:lvl w:ilvl="4">
+      <w:start w:val="1"/>
+      <w:numFmt w:val="none"/>
+      <w:suff w:val="nothing"/>
+      <w:lvlText w:val="%5"/>
+      <w:lvlJc w:val="start"/>
+      <w:pPr>
+        <w:tabs>
+          <w:tab w:val="num" w:pos="0"/>
+        </w:tabs>
+        <w:ind w:start="0" w:hanging="0"/>
+      </w:pPr>
+      <w:rPr/>
+    </w:lvl>
+    <w:lvl w:ilvl="5">
+      <w:start w:val="1"/>
+      <w:numFmt w:val="none"/>
+      <w:suff w:val="nothing"/>
+      <w:lvlText w:val="%6"/>
+      <w:lvlJc w:val="start"/>
+      <w:pPr>
+        <w:tabs>
+          <w:tab w:val="num" w:pos="0"/>
+        </w:tabs>
+        <w:ind w:start="0" w:hanging="0"/>
+      </w:pPr>
+      <w:rPr/>
+    </w:lvl>
+    <w:lvl w:ilvl="6">
+      <w:start w:val="1"/>
+      <w:numFmt w:val="none"/>
+      <w:suff w:val="nothing"/>
+      <w:lvlText w:val="%7"/>
+      <w:lvlJc w:val="start"/>
+      <w:pPr>
+        <w:tabs>
+          <w:tab w:val="num" w:pos="0"/>
+        </w:tabs>
+        <w:ind w:start="0" w:hanging="0"/>
+      </w:pPr>
+      <w:rPr/>
+    </w:lvl>
+    <w:lvl w:ilvl="7">
+      <w:start w:val="1"/>
+      <w:numFmt w:val="none"/>
+      <w:suff w:val="nothing"/>
+      <w:lvlText w:val="%8"/>
+      <w:lvlJc w:val="start"/>
+      <w:pPr>
+        <w:tabs>
+          <w:tab w:val="num" w:pos="0"/>
+        </w:tabs>
+        <w:ind w:start="0" w:hanging="0"/>
+      </w:pPr>
+      <w:rPr/>
+    </w:lvl>
+    <w:lvl w:ilvl="8">
+      <w:start w:val="1"/>
+      <w:numFmt w:val="none"/>
+      <w:suff w:val="nothing"/>
+      <w:lvlText w:val="%9"/>
+      <w:lvlJc w:val="start"/>
+      <w:pPr>
+        <w:tabs>
+          <w:tab w:val="num" w:pos="0"/>
+        </w:tabs>
+        <w:ind w:start="0" w:hanging="0"/>
+      </w:pPr>
+      <w:rPr/>
+    </w:lvl>
+  </w:abstractNum>
+  <w:abstractNum w:abstractNumId="2">
+    <w:lvl w:ilvl="0">
+      <w:start w:val="1"/>
+      <w:numFmt w:val="decimal"/>
+      <w:lvlText w:val="%1."/>
+      <w:lvlJc w:val="start"/>
+      <w:pPr>
+        <w:tabs>
+          <w:tab w:val="num" w:pos="720"/>
+        </w:tabs>
+        <w:ind w:start="720" w:hanging="360"/>
+      </w:pPr>
+      <w:rPr/>
+    </w:lvl>
+    <w:lvl w:ilvl="1">
+      <w:start w:val="1"/>
+      <w:numFmt w:val="decimal"/>
+      <w:lvlText w:val="%2."/>
+      <w:lvlJc w:val="start"/>
+      <w:pPr>
+        <w:tabs>
+          <w:tab w:val="num" w:pos="1080"/>
+        </w:tabs>
+        <w:ind w:start="1080" w:hanging="360"/>
+      </w:pPr>
+      <w:rPr/>
+    </w:lvl>
+    <w:lvl w:ilvl="2">
+      <w:start w:val="1"/>
+      <w:numFmt w:val="decimal"/>
+      <w:lvlText w:val="%3."/>
+      <w:lvlJc w:val="start"/>
+      <w:pPr>
+        <w:tabs>
+          <w:tab w:val="num" w:pos="1440"/>
+        </w:tabs>
+        <w:ind w:start="1440" w:hanging="360"/>
+      </w:pPr>
+      <w:rPr/>
+    </w:lvl>
+    <w:lvl w:ilvl="3">
+      <w:start w:val="1"/>
+      <w:numFmt w:val="decimal"/>
+      <w:lvlText w:val="%4."/>
+      <w:lvlJc w:val="start"/>
+      <w:pPr>
+        <w:tabs>
+          <w:tab w:val="num" w:pos="1800"/>
+        </w:tabs>
+        <w:ind w:start="1800" w:hanging="360"/>
+      </w:pPr>
+      <w:rPr/>
+    </w:lvl>
+    <w:lvl w:ilvl="4">
+      <w:start w:val="1"/>
+      <w:numFmt w:val="decimal"/>
+      <w:lvlText w:val="%5."/>
+      <w:lvlJc w:val="start"/>
+      <w:pPr>
+        <w:tabs>
+          <w:tab w:val="num" w:pos="2160"/>
+        </w:tabs>
+        <w:ind w:start="2160" w:hanging="360"/>
+      </w:pPr>
+      <w:rPr/>
+    </w:lvl>
+    <w:lvl w:ilvl="5">
+      <w:start w:val="1"/>
+      <w:numFmt w:val="decimal"/>
+      <w:lvlText w:val="%6."/>
+      <w:lvlJc w:val="start"/>
+      <w:pPr>
+        <w:tabs>
+          <w:tab w:val="num" w:pos="2520"/>
+        </w:tabs>
+        <w:ind w:start="2520" w:hanging="360"/>
+      </w:pPr>
+      <w:rPr/>
+    </w:lvl>
+    <w:lvl w:ilvl="6">
+      <w:start w:val="1"/>
+      <w:numFmt w:val="decimal"/>
+      <w:lvlText w:val="%7."/>
+      <w:lvlJc w:val="start"/>
+      <w:pPr>
+        <w:tabs>
+          <w:tab w:val="num" w:pos="2880"/>
+        </w:tabs>
+        <w:ind w:start="2880" w:hanging="360"/>
+      </w:pPr>
+      <w:rPr/>
+    </w:lvl>
+    <w:lvl w:ilvl="7">
+      <w:start w:val="1"/>
+      <w:numFmt w:val="decimal"/>
+      <w:lvlText w:val="%8."/>
+      <w:lvlJc w:val="start"/>
+      <w:pPr>
+        <w:tabs>
+          <w:tab w:val="num" w:pos="3240"/>
+        </w:tabs>
+        <w:ind w:start="3240" w:hanging="360"/>
+      </w:pPr>
+      <w:rPr/>
+    </w:lvl>
+    <w:lvl w:ilvl="8">
+      <w:start w:val="1"/>
+      <w:numFmt w:val="decimal"/>
+      <w:lvlText w:val="%9."/>
+      <w:lvlJc w:val="start"/>
+      <w:pPr>
+        <w:tabs>
+          <w:tab w:val="num" w:pos="3600"/>
+        </w:tabs>
+        <w:ind w:start="3600" w:hanging="360"/>
+      </w:pPr>
+      <w:rPr/>
+    </w:lvl>
+  </w:abstractNum>
+  <w:abstractNum w:abstractNumId="3">
+    <w:lvl w:ilvl="0">
+      <w:start w:val="1"/>
+      <w:numFmt w:val="decimal"/>
+      <w:lvlText w:val="%1."/>
+      <w:lvlJc w:val="start"/>
+      <w:pPr>
+        <w:tabs>
+          <w:tab w:val="num" w:pos="720"/>
+        </w:tabs>
+        <w:ind w:start="720" w:hanging="360"/>
+      </w:pPr>
+      <w:rPr/>
+    </w:lvl>
+    <w:lvl w:ilvl="1">
+      <w:start w:val="1"/>
+      <w:numFmt w:val="decimal"/>
+      <w:lvlText w:val="%2."/>
+      <w:lvlJc w:val="start"/>
+      <w:pPr>
+        <w:tabs>
+          <w:tab w:val="num" w:pos="1080"/>
+        </w:tabs>
+        <w:ind w:start="1080" w:hanging="360"/>
+      </w:pPr>
+      <w:rPr/>
+    </w:lvl>
+    <w:lvl w:ilvl="2">
+      <w:start w:val="1"/>
+      <w:numFmt w:val="decimal"/>
+      <w:lvlText w:val="%3."/>
+      <w:lvlJc w:val="start"/>
+      <w:pPr>
+        <w:tabs>
+          <w:tab w:val="num" w:pos="1440"/>
+        </w:tabs>
+        <w:ind w:start="1440" w:hanging="360"/>
+      </w:pPr>
+      <w:rPr/>
+    </w:lvl>
+    <w:lvl w:ilvl="3">
+      <w:start w:val="1"/>
+      <w:numFmt w:val="decimal"/>
+      <w:lvlText w:val="%4."/>
+      <w:lvlJc w:val="start"/>
+      <w:pPr>
+        <w:tabs>
+          <w:tab w:val="num" w:pos="1800"/>
+        </w:tabs>
+        <w:ind w:start="1800" w:hanging="360"/>
+      </w:pPr>
+      <w:rPr/>
+    </w:lvl>
+    <w:lvl w:ilvl="4">
+      <w:start w:val="1"/>
+      <w:numFmt w:val="decimal"/>
+      <w:lvlText w:val="%5."/>
+      <w:lvlJc w:val="start"/>
+      <w:pPr>
+        <w:tabs>
+          <w:tab w:val="num" w:pos="2160"/>
+        </w:tabs>
+        <w:ind w:start="2160" w:hanging="360"/>
+      </w:pPr>
+      <w:rPr/>
+    </w:lvl>
+    <w:lvl w:ilvl="5">
+      <w:start w:val="1"/>
+      <w:numFmt w:val="decimal"/>
+      <w:lvlText w:val="%6."/>
+      <w:lvlJc w:val="start"/>
+      <w:pPr>
+        <w:tabs>
+          <w:tab w:val="num" w:pos="2520"/>
+        </w:tabs>
+        <w:ind w:start="2520" w:hanging="360"/>
+      </w:pPr>
+      <w:rPr/>
+    </w:lvl>
+    <w:lvl w:ilvl="6">
+      <w:start w:val="1"/>
+      <w:numFmt w:val="decimal"/>
+      <w:lvlText w:val="%7."/>
+      <w:lvlJc w:val="start"/>
+      <w:pPr>
+        <w:tabs>
+          <w:tab w:val="num" w:pos="2880"/>
+        </w:tabs>
+        <w:ind w:start="2880" w:hanging="360"/>
+      </w:pPr>
+      <w:rPr/>
+    </w:lvl>
+    <w:lvl w:ilvl="7">
+      <w:start w:val="1"/>
+      <w:numFmt w:val="decimal"/>
+      <w:lvlText w:val="%8."/>
+      <w:lvlJc w:val="start"/>
+      <w:pPr>
+        <w:tabs>
+          <w:tab w:val="num" w:pos="3240"/>
+        </w:tabs>
+        <w:ind w:start="3240" w:hanging="360"/>
+      </w:pPr>
+      <w:rPr/>
+    </w:lvl>
+    <w:lvl w:ilvl="8">
+      <w:start w:val="1"/>
+      <w:numFmt w:val="decimal"/>
+      <w:lvlText w:val="%9."/>
+      <w:lvlJc w:val="start"/>
+      <w:pPr>
+        <w:tabs>
+          <w:tab w:val="num" w:pos="3600"/>
+        </w:tabs>
+        <w:ind w:start="3600" w:hanging="360"/>
+      </w:pPr>
+      <w:rPr/>
+    </w:lvl>
+  </w:abstractNum>
+  <w:abstractNum w:abstractNumId="4">
+    <w:lvl w:ilvl="0">
+      <w:start w:val="1"/>
+      <w:numFmt w:val="decimal"/>
+      <w:lvlText w:val="%1."/>
+      <w:lvlJc w:val="start"/>
+      <w:pPr>
+        <w:tabs>
+          <w:tab w:val="num" w:pos="720"/>
+        </w:tabs>
+        <w:ind w:start="720" w:hanging="360"/>
+      </w:pPr>
+      <w:rPr/>
+    </w:lvl>
+    <w:lvl w:ilvl="1">
+      <w:start w:val="1"/>
+      <w:numFmt w:val="decimal"/>
+      <w:lvlText w:val="%2."/>
+      <w:lvlJc w:val="start"/>
+      <w:pPr>
+        <w:tabs>
+          <w:tab w:val="num" w:pos="1080"/>
+        </w:tabs>
+        <w:ind w:start="1080" w:hanging="360"/>
+      </w:pPr>
+      <w:rPr/>
+    </w:lvl>
+    <w:lvl w:ilvl="2">
+      <w:start w:val="1"/>
+      <w:numFmt w:val="decimal"/>
+      <w:lvlText w:val="%3."/>
+      <w:lvlJc w:val="start"/>
+      <w:pPr>
+        <w:tabs>
+          <w:tab w:val="num" w:pos="1440"/>
+        </w:tabs>
+        <w:ind w:start="1440" w:hanging="360"/>
+      </w:pPr>
+      <w:rPr/>
+    </w:lvl>
+    <w:lvl w:ilvl="3">
+      <w:start w:val="1"/>
+      <w:numFmt w:val="decimal"/>
+      <w:lvlText w:val="%4."/>
+      <w:lvlJc w:val="start"/>
+      <w:pPr>
+        <w:tabs>
+          <w:tab w:val="num" w:pos="1800"/>
+        </w:tabs>
+        <w:ind w:start="1800" w:hanging="360"/>
+      </w:pPr>
+      <w:rPr/>
+    </w:lvl>
+    <w:lvl w:ilvl="4">
+      <w:start w:val="1"/>
+      <w:numFmt w:val="decimal"/>
+      <w:lvlText w:val="%5."/>
+      <w:lvlJc w:val="start"/>
+      <w:pPr>
+        <w:tabs>
+          <w:tab w:val="num" w:pos="2160"/>
+        </w:tabs>
+        <w:ind w:start="2160" w:hanging="360"/>
+      </w:pPr>
+      <w:rPr/>
+    </w:lvl>
+    <w:lvl w:ilvl="5">
+      <w:start w:val="1"/>
+      <w:numFmt w:val="decimal"/>
+      <w:lvlText w:val="%6."/>
+      <w:lvlJc w:val="start"/>
+      <w:pPr>
+        <w:tabs>
+          <w:tab w:val="num" w:pos="2520"/>
+        </w:tabs>
+        <w:ind w:start="2520" w:hanging="360"/>
+      </w:pPr>
+      <w:rPr/>
+    </w:lvl>
+    <w:lvl w:ilvl="6">
+      <w:start w:val="1"/>
+      <w:numFmt w:val="decimal"/>
+      <w:lvlText w:val="%7."/>
+      <w:lvlJc w:val="start"/>
+      <w:pPr>
+        <w:tabs>
+          <w:tab w:val="num" w:pos="2880"/>
+        </w:tabs>
+        <w:ind w:start="2880" w:hanging="360"/>
+      </w:pPr>
+      <w:rPr/>
+    </w:lvl>
+    <w:lvl w:ilvl="7">
+      <w:start w:val="1"/>
+      <w:numFmt w:val="decimal"/>
+      <w:lvlText w:val="%8."/>
+      <w:lvlJc w:val="start"/>
+      <w:pPr>
+        <w:tabs>
+          <w:tab w:val="num" w:pos="3240"/>
+        </w:tabs>
+        <w:ind w:start="3240" w:hanging="360"/>
+      </w:pPr>
+      <w:rPr/>
+    </w:lvl>
+    <w:lvl w:ilvl="8">
+      <w:start w:val="1"/>
+      <w:numFmt w:val="decimal"/>
+      <w:lvlText w:val="%9."/>
+      <w:lvlJc w:val="start"/>
+      <w:pPr>
+        <w:tabs>
+          <w:tab w:val="num" w:pos="3600"/>
+        </w:tabs>
+        <w:ind w:start="3600" w:hanging="360"/>
+      </w:pPr>
+      <w:rPr/>
+    </w:lvl>
+  </w:abstractNum>
+  <w:abstractNum w:abstractNumId="5">
+    <w:lvl w:ilvl="0">
       <w:start w:val="1"/>
       <w:numFmt w:val="none"/>
       <w:suff w:val="nothing"/>
@@ -2780,7 +3195,7 @@
         <w:ind w:start="0" w:hanging="0"/>
       </w:pPr>
     </w:lvl>
-    <w:lvl w:ilvl="2">
+    <w:lvl w:ilvl="1">
       <w:start w:val="1"/>
       <w:numFmt w:val="none"/>
       <w:suff w:val="nothing"/>
@@ -2793,7 +3208,7 @@
         <w:ind w:start="0" w:hanging="0"/>
       </w:pPr>
     </w:lvl>
-    <w:lvl w:ilvl="3">
+    <w:lvl w:ilvl="2">
       <w:start w:val="1"/>
       <w:numFmt w:val="none"/>
       <w:suff w:val="nothing"/>
@@ -2806,7 +3221,7 @@
         <w:ind w:start="0" w:hanging="0"/>
       </w:pPr>
     </w:lvl>
-    <w:lvl w:ilvl="4">
+    <w:lvl w:ilvl="3">
       <w:start w:val="1"/>
       <w:numFmt w:val="none"/>
       <w:suff w:val="nothing"/>
@@ -2819,7 +3234,7 @@
         <w:ind w:start="0" w:hanging="0"/>
       </w:pPr>
     </w:lvl>
-    <w:lvl w:ilvl="5">
+    <w:lvl w:ilvl="4">
       <w:start w:val="1"/>
       <w:numFmt w:val="none"/>
       <w:suff w:val="nothing"/>
@@ -2832,7 +3247,7 @@
         <w:ind w:start="0" w:hanging="0"/>
       </w:pPr>
     </w:lvl>
-    <w:lvl w:ilvl="6">
+    <w:lvl w:ilvl="5">
       <w:start w:val="1"/>
       <w:numFmt w:val="none"/>
       <w:suff w:val="nothing"/>
@@ -2845,7 +3260,7 @@
         <w:ind w:start="0" w:hanging="0"/>
       </w:pPr>
     </w:lvl>
-    <w:lvl w:ilvl="7">
+    <w:lvl w:ilvl="6">
       <w:start w:val="1"/>
       <w:numFmt w:val="none"/>
       <w:suff w:val="nothing"/>
@@ -2858,7 +3273,7 @@
         <w:ind w:start="0" w:hanging="0"/>
       </w:pPr>
     </w:lvl>
-    <w:lvl w:ilvl="8">
+    <w:lvl w:ilvl="7">
       <w:start w:val="1"/>
       <w:numFmt w:val="none"/>
       <w:suff w:val="nothing"/>
@@ -2871,13 +3286,11 @@
         <w:ind w:start="0" w:hanging="0"/>
       </w:pPr>
     </w:lvl>
-  </w:abstractNum>
-  <w:abstractNum w:abstractNumId="2">
-    <w:lvl w:ilvl="0">
+    <w:lvl w:ilvl="8">
       <w:start w:val="1"/>
       <w:numFmt w:val="none"/>
       <w:suff w:val="nothing"/>
-      <w:lvlText w:val="%1"/>
+      <w:lvlText w:val=""/>
       <w:lvlJc w:val="start"/>
       <w:pPr>
         <w:tabs>
@@ -2885,476 +3298,6 @@
         </w:tabs>
         <w:ind w:start="0" w:hanging="0"/>
       </w:pPr>
-      <w:rPr/>
-    </w:lvl>
-    <w:lvl w:ilvl="1">
-      <w:start w:val="1"/>
-      <w:numFmt w:val="none"/>
-      <w:suff w:val="nothing"/>
-      <w:lvlText w:val="%2"/>
-      <w:lvlJc w:val="start"/>
-      <w:pPr>
-        <w:tabs>
-          <w:tab w:val="num" w:pos="0"/>
-        </w:tabs>
-        <w:ind w:start="0" w:hanging="0"/>
-      </w:pPr>
-      <w:rPr/>
-    </w:lvl>
-    <w:lvl w:ilvl="2">
-      <w:start w:val="1"/>
-      <w:numFmt w:val="none"/>
-      <w:suff w:val="nothing"/>
-      <w:lvlText w:val="%3"/>
-      <w:lvlJc w:val="start"/>
-      <w:pPr>
-        <w:tabs>
-          <w:tab w:val="num" w:pos="0"/>
-        </w:tabs>
-        <w:ind w:start="0" w:hanging="0"/>
-      </w:pPr>
-      <w:rPr/>
-    </w:lvl>
-    <w:lvl w:ilvl="3">
-      <w:start w:val="1"/>
-      <w:numFmt w:val="none"/>
-      <w:suff w:val="nothing"/>
-      <w:lvlText w:val="%4"/>
-      <w:lvlJc w:val="start"/>
-      <w:pPr>
-        <w:tabs>
-          <w:tab w:val="num" w:pos="0"/>
-        </w:tabs>
-        <w:ind w:start="0" w:hanging="0"/>
-      </w:pPr>
-      <w:rPr/>
-    </w:lvl>
-    <w:lvl w:ilvl="4">
-      <w:start w:val="1"/>
-      <w:numFmt w:val="none"/>
-      <w:suff w:val="nothing"/>
-      <w:lvlText w:val="%5"/>
-      <w:lvlJc w:val="start"/>
-      <w:pPr>
-        <w:tabs>
-          <w:tab w:val="num" w:pos="0"/>
-        </w:tabs>
-        <w:ind w:start="0" w:hanging="0"/>
-      </w:pPr>
-      <w:rPr/>
-    </w:lvl>
-    <w:lvl w:ilvl="5">
-      <w:start w:val="1"/>
-      <w:numFmt w:val="none"/>
-      <w:suff w:val="nothing"/>
-      <w:lvlText w:val="%6"/>
-      <w:lvlJc w:val="start"/>
-      <w:pPr>
-        <w:tabs>
-          <w:tab w:val="num" w:pos="0"/>
-        </w:tabs>
-        <w:ind w:start="0" w:hanging="0"/>
-      </w:pPr>
-      <w:rPr/>
-    </w:lvl>
-    <w:lvl w:ilvl="6">
-      <w:start w:val="1"/>
-      <w:numFmt w:val="none"/>
-      <w:suff w:val="nothing"/>
-      <w:lvlText w:val="%7"/>
-      <w:lvlJc w:val="start"/>
-      <w:pPr>
-        <w:tabs>
-          <w:tab w:val="num" w:pos="0"/>
-        </w:tabs>
-        <w:ind w:start="0" w:hanging="0"/>
-      </w:pPr>
-      <w:rPr/>
-    </w:lvl>
-    <w:lvl w:ilvl="7">
-      <w:start w:val="1"/>
-      <w:numFmt w:val="none"/>
-      <w:suff w:val="nothing"/>
-      <w:lvlText w:val="%8"/>
-      <w:lvlJc w:val="start"/>
-      <w:pPr>
-        <w:tabs>
-          <w:tab w:val="num" w:pos="0"/>
-        </w:tabs>
-        <w:ind w:start="0" w:hanging="0"/>
-      </w:pPr>
-      <w:rPr/>
-    </w:lvl>
-    <w:lvl w:ilvl="8">
-      <w:start w:val="1"/>
-      <w:numFmt w:val="none"/>
-      <w:suff w:val="nothing"/>
-      <w:lvlText w:val="%9"/>
-      <w:lvlJc w:val="start"/>
-      <w:pPr>
-        <w:tabs>
-          <w:tab w:val="num" w:pos="0"/>
-        </w:tabs>
-        <w:ind w:start="0" w:hanging="0"/>
-      </w:pPr>
-      <w:rPr/>
-    </w:lvl>
-  </w:abstractNum>
-  <w:abstractNum w:abstractNumId="3">
-    <w:lvl w:ilvl="0">
-      <w:start w:val="1"/>
-      <w:numFmt w:val="decimal"/>
-      <w:lvlText w:val="%1."/>
-      <w:lvlJc w:val="start"/>
-      <w:pPr>
-        <w:tabs>
-          <w:tab w:val="num" w:pos="720"/>
-        </w:tabs>
-        <w:ind w:start="720" w:hanging="360"/>
-      </w:pPr>
-      <w:rPr/>
-    </w:lvl>
-    <w:lvl w:ilvl="1">
-      <w:start w:val="1"/>
-      <w:numFmt w:val="decimal"/>
-      <w:lvlText w:val="%2."/>
-      <w:lvlJc w:val="start"/>
-      <w:pPr>
-        <w:tabs>
-          <w:tab w:val="num" w:pos="1080"/>
-        </w:tabs>
-        <w:ind w:start="1080" w:hanging="360"/>
-      </w:pPr>
-      <w:rPr/>
-    </w:lvl>
-    <w:lvl w:ilvl="2">
-      <w:start w:val="1"/>
-      <w:numFmt w:val="decimal"/>
-      <w:lvlText w:val="%3."/>
-      <w:lvlJc w:val="start"/>
-      <w:pPr>
-        <w:tabs>
-          <w:tab w:val="num" w:pos="1440"/>
-        </w:tabs>
-        <w:ind w:start="1440" w:hanging="360"/>
-      </w:pPr>
-      <w:rPr/>
-    </w:lvl>
-    <w:lvl w:ilvl="3">
-      <w:start w:val="1"/>
-      <w:numFmt w:val="decimal"/>
-      <w:lvlText w:val="%4."/>
-      <w:lvlJc w:val="start"/>
-      <w:pPr>
-        <w:tabs>
-          <w:tab w:val="num" w:pos="1800"/>
-        </w:tabs>
-        <w:ind w:start="1800" w:hanging="360"/>
-      </w:pPr>
-      <w:rPr/>
-    </w:lvl>
-    <w:lvl w:ilvl="4">
-      <w:start w:val="1"/>
-      <w:numFmt w:val="decimal"/>
-      <w:lvlText w:val="%5."/>
-      <w:lvlJc w:val="start"/>
-      <w:pPr>
-        <w:tabs>
-          <w:tab w:val="num" w:pos="2160"/>
-        </w:tabs>
-        <w:ind w:start="2160" w:hanging="360"/>
-      </w:pPr>
-      <w:rPr/>
-    </w:lvl>
-    <w:lvl w:ilvl="5">
-      <w:start w:val="1"/>
-      <w:numFmt w:val="decimal"/>
-      <w:lvlText w:val="%6."/>
-      <w:lvlJc w:val="start"/>
-      <w:pPr>
-        <w:tabs>
-          <w:tab w:val="num" w:pos="2520"/>
-        </w:tabs>
-        <w:ind w:start="2520" w:hanging="360"/>
-      </w:pPr>
-      <w:rPr/>
-    </w:lvl>
-    <w:lvl w:ilvl="6">
-      <w:start w:val="1"/>
-      <w:numFmt w:val="decimal"/>
-      <w:lvlText w:val="%7."/>
-      <w:lvlJc w:val="start"/>
-      <w:pPr>
-        <w:tabs>
-          <w:tab w:val="num" w:pos="2880"/>
-        </w:tabs>
-        <w:ind w:start="2880" w:hanging="360"/>
-      </w:pPr>
-      <w:rPr/>
-    </w:lvl>
-    <w:lvl w:ilvl="7">
-      <w:start w:val="1"/>
-      <w:numFmt w:val="decimal"/>
-      <w:lvlText w:val="%8."/>
-      <w:lvlJc w:val="start"/>
-      <w:pPr>
-        <w:tabs>
-          <w:tab w:val="num" w:pos="3240"/>
-        </w:tabs>
-        <w:ind w:start="3240" w:hanging="360"/>
-      </w:pPr>
-      <w:rPr/>
-    </w:lvl>
-    <w:lvl w:ilvl="8">
-      <w:start w:val="1"/>
-      <w:numFmt w:val="decimal"/>
-      <w:lvlText w:val="%9."/>
-      <w:lvlJc w:val="start"/>
-      <w:pPr>
-        <w:tabs>
-          <w:tab w:val="num" w:pos="3600"/>
-        </w:tabs>
-        <w:ind w:start="3600" w:hanging="360"/>
-      </w:pPr>
-      <w:rPr/>
-    </w:lvl>
-  </w:abstractNum>
-  <w:abstractNum w:abstractNumId="4">
-    <w:lvl w:ilvl="0">
-      <w:start w:val="1"/>
-      <w:numFmt w:val="decimal"/>
-      <w:lvlText w:val="%1."/>
-      <w:lvlJc w:val="start"/>
-      <w:pPr>
-        <w:tabs>
-          <w:tab w:val="num" w:pos="720"/>
-        </w:tabs>
-        <w:ind w:start="720" w:hanging="360"/>
-      </w:pPr>
-      <w:rPr/>
-    </w:lvl>
-    <w:lvl w:ilvl="1">
-      <w:start w:val="1"/>
-      <w:numFmt w:val="decimal"/>
-      <w:lvlText w:val="%2."/>
-      <w:lvlJc w:val="start"/>
-      <w:pPr>
-        <w:tabs>
-          <w:tab w:val="num" w:pos="1080"/>
-        </w:tabs>
-        <w:ind w:start="1080" w:hanging="360"/>
-      </w:pPr>
-      <w:rPr/>
-    </w:lvl>
-    <w:lvl w:ilvl="2">
-      <w:start w:val="1"/>
-      <w:numFmt w:val="decimal"/>
-      <w:lvlText w:val="%3."/>
-      <w:lvlJc w:val="start"/>
-      <w:pPr>
-        <w:tabs>
-          <w:tab w:val="num" w:pos="1440"/>
-        </w:tabs>
-        <w:ind w:start="1440" w:hanging="360"/>
-      </w:pPr>
-      <w:rPr/>
-    </w:lvl>
-    <w:lvl w:ilvl="3">
-      <w:start w:val="1"/>
-      <w:numFmt w:val="decimal"/>
-      <w:lvlText w:val="%4."/>
-      <w:lvlJc w:val="start"/>
-      <w:pPr>
-        <w:tabs>
-          <w:tab w:val="num" w:pos="1800"/>
-        </w:tabs>
-        <w:ind w:start="1800" w:hanging="360"/>
-      </w:pPr>
-      <w:rPr/>
-    </w:lvl>
-    <w:lvl w:ilvl="4">
-      <w:start w:val="1"/>
-      <w:numFmt w:val="decimal"/>
-      <w:lvlText w:val="%5."/>
-      <w:lvlJc w:val="start"/>
-      <w:pPr>
-        <w:tabs>
-          <w:tab w:val="num" w:pos="2160"/>
-        </w:tabs>
-        <w:ind w:start="2160" w:hanging="360"/>
-      </w:pPr>
-      <w:rPr/>
-    </w:lvl>
-    <w:lvl w:ilvl="5">
-      <w:start w:val="1"/>
-      <w:numFmt w:val="decimal"/>
-      <w:lvlText w:val="%6."/>
-      <w:lvlJc w:val="start"/>
-      <w:pPr>
-        <w:tabs>
-          <w:tab w:val="num" w:pos="2520"/>
-        </w:tabs>
-        <w:ind w:start="2520" w:hanging="360"/>
-      </w:pPr>
-      <w:rPr/>
-    </w:lvl>
-    <w:lvl w:ilvl="6">
-      <w:start w:val="1"/>
-      <w:numFmt w:val="decimal"/>
-      <w:lvlText w:val="%7."/>
-      <w:lvlJc w:val="start"/>
-      <w:pPr>
-        <w:tabs>
-          <w:tab w:val="num" w:pos="2880"/>
-        </w:tabs>
-        <w:ind w:start="2880" w:hanging="360"/>
-      </w:pPr>
-      <w:rPr/>
-    </w:lvl>
-    <w:lvl w:ilvl="7">
-      <w:start w:val="1"/>
-      <w:numFmt w:val="decimal"/>
-      <w:lvlText w:val="%8."/>
-      <w:lvlJc w:val="start"/>
-      <w:pPr>
-        <w:tabs>
-          <w:tab w:val="num" w:pos="3240"/>
-        </w:tabs>
-        <w:ind w:start="3240" w:hanging="360"/>
-      </w:pPr>
-      <w:rPr/>
-    </w:lvl>
-    <w:lvl w:ilvl="8">
-      <w:start w:val="1"/>
-      <w:numFmt w:val="decimal"/>
-      <w:lvlText w:val="%9."/>
-      <w:lvlJc w:val="start"/>
-      <w:pPr>
-        <w:tabs>
-          <w:tab w:val="num" w:pos="3600"/>
-        </w:tabs>
-        <w:ind w:start="3600" w:hanging="360"/>
-      </w:pPr>
-      <w:rPr/>
-    </w:lvl>
-  </w:abstractNum>
-  <w:abstractNum w:abstractNumId="5">
-    <w:lvl w:ilvl="0">
-      <w:start w:val="1"/>
-      <w:numFmt w:val="decimal"/>
-      <w:lvlText w:val="%1."/>
-      <w:lvlJc w:val="start"/>
-      <w:pPr>
-        <w:tabs>
-          <w:tab w:val="num" w:pos="720"/>
-        </w:tabs>
-        <w:ind w:start="720" w:hanging="360"/>
-      </w:pPr>
-      <w:rPr/>
-    </w:lvl>
-    <w:lvl w:ilvl="1">
-      <w:start w:val="1"/>
-      <w:numFmt w:val="decimal"/>
-      <w:lvlText w:val="%2."/>
-      <w:lvlJc w:val="start"/>
-      <w:pPr>
-        <w:tabs>
-          <w:tab w:val="num" w:pos="1080"/>
-        </w:tabs>
-        <w:ind w:start="1080" w:hanging="360"/>
-      </w:pPr>
-      <w:rPr/>
-    </w:lvl>
-    <w:lvl w:ilvl="2">
-      <w:start w:val="1"/>
-      <w:numFmt w:val="decimal"/>
-      <w:lvlText w:val="%3."/>
-      <w:lvlJc w:val="start"/>
-      <w:pPr>
-        <w:tabs>
-          <w:tab w:val="num" w:pos="1440"/>
-        </w:tabs>
-        <w:ind w:start="1440" w:hanging="360"/>
-      </w:pPr>
-      <w:rPr/>
-    </w:lvl>
-    <w:lvl w:ilvl="3">
-      <w:start w:val="1"/>
-      <w:numFmt w:val="decimal"/>
-      <w:lvlText w:val="%4."/>
-      <w:lvlJc w:val="start"/>
-      <w:pPr>
-        <w:tabs>
-          <w:tab w:val="num" w:pos="1800"/>
-        </w:tabs>
-        <w:ind w:start="1800" w:hanging="360"/>
-      </w:pPr>
-      <w:rPr/>
-    </w:lvl>
-    <w:lvl w:ilvl="4">
-      <w:start w:val="1"/>
-      <w:numFmt w:val="decimal"/>
-      <w:lvlText w:val="%5."/>
-      <w:lvlJc w:val="start"/>
-      <w:pPr>
-        <w:tabs>
-          <w:tab w:val="num" w:pos="2160"/>
-        </w:tabs>
-        <w:ind w:start="2160" w:hanging="360"/>
-      </w:pPr>
-      <w:rPr/>
-    </w:lvl>
-    <w:lvl w:ilvl="5">
-      <w:start w:val="1"/>
-      <w:numFmt w:val="decimal"/>
-      <w:lvlText w:val="%6."/>
-      <w:lvlJc w:val="start"/>
-      <w:pPr>
-        <w:tabs>
-          <w:tab w:val="num" w:pos="2520"/>
-        </w:tabs>
-        <w:ind w:start="2520" w:hanging="360"/>
-      </w:pPr>
-      <w:rPr/>
-    </w:lvl>
-    <w:lvl w:ilvl="6">
-      <w:start w:val="1"/>
-      <w:numFmt w:val="decimal"/>
-      <w:lvlText w:val="%7."/>
-      <w:lvlJc w:val="start"/>
-      <w:pPr>
-        <w:tabs>
-          <w:tab w:val="num" w:pos="2880"/>
-        </w:tabs>
-        <w:ind w:start="2880" w:hanging="360"/>
-      </w:pPr>
-      <w:rPr/>
-    </w:lvl>
-    <w:lvl w:ilvl="7">
-      <w:start w:val="1"/>
-      <w:numFmt w:val="decimal"/>
-      <w:lvlText w:val="%8."/>
-      <w:lvlJc w:val="start"/>
-      <w:pPr>
-        <w:tabs>
-          <w:tab w:val="num" w:pos="3240"/>
-        </w:tabs>
-        <w:ind w:start="3240" w:hanging="360"/>
-      </w:pPr>
-      <w:rPr/>
-    </w:lvl>
-    <w:lvl w:ilvl="8">
-      <w:start w:val="1"/>
-      <w:numFmt w:val="decimal"/>
-      <w:lvlText w:val="%9."/>
-      <w:lvlJc w:val="start"/>
-      <w:pPr>
-        <w:tabs>
-          <w:tab w:val="num" w:pos="3600"/>
-        </w:tabs>
-        <w:ind w:start="3600" w:hanging="360"/>
-      </w:pPr>
-      <w:rPr/>
     </w:lvl>
   </w:abstractNum>
   <w:num w:numId="1">
@@ -3399,7 +3342,7 @@
     <w:pPr>
       <w:widowControl/>
       <w:suppressAutoHyphens w:val="true"/>
-      <w:overflowPunct w:val="true"/>
+      <w:overflowPunct w:val="false"/>
       <w:bidi w:val="0"/>
       <w:snapToGrid w:val="false"/>
       <w:spacing w:before="0" w:after="0"/>
@@ -3423,7 +3366,7 @@
     <w:pPr>
       <w:numPr>
         <w:ilvl w:val="0"/>
-        <w:numId w:val="2"/>
+        <w:numId w:val="1"/>
       </w:numPr>
       <w:spacing w:before="240" w:after="120"/>
       <w:outlineLvl w:val="0"/>
@@ -3451,8 +3394,8 @@
       <w:bCs/>
     </w:rPr>
   </w:style>
-  <w:style w:type="character" w:styleId="Bullets">
-    <w:name w:val="Bullets"/>
+  <w:style w:type="character" w:styleId="Bulletsuser">
+    <w:name w:val="Bullets (user)"/>
     <w:qFormat/>
     <w:rPr>
       <w:rFonts w:ascii="OpenSymbol" w:hAnsi="OpenSymbol" w:eastAsia="OpenSymbol" w:cs="OpenSymbol"/>
@@ -3474,13 +3417,13 @@
     <w:name w:val="line number"/>
     <w:rPr/>
   </w:style>
-  <w:style w:type="character" w:styleId="FootnoteCharacters">
-    <w:name w:val="Footnote Characters"/>
+  <w:style w:type="character" w:styleId="FootnoteCharactersuser">
+    <w:name w:val="Footnote Characters (user)"/>
     <w:qFormat/>
     <w:rPr/>
   </w:style>
-  <w:style w:type="character" w:styleId="EndnoteCharacters">
-    <w:name w:val="Endnote Characters"/>
+  <w:style w:type="character" w:styleId="EndnoteCharactersuser">
+    <w:name w:val="Endnote Characters (user)"/>
     <w:qFormat/>
     <w:rPr/>
   </w:style>
@@ -3569,7 +3512,7 @@
     <w:pPr>
       <w:widowControl/>
       <w:suppressAutoHyphens w:val="true"/>
-      <w:overflowPunct w:val="true"/>
+      <w:overflowPunct w:val="false"/>
       <w:bidi w:val="0"/>
       <w:spacing w:before="0" w:after="0"/>
       <w:jc w:val="start"/>

</xml_diff>